<commit_message>
Add gold-matrix charts and integrate results into research paper
</commit_message>
<xml_diff>
--- a/reports/research-paper/ParkGuide_AI_Research_Paper.docx
+++ b/reports/research-paper/ParkGuide_AI_Research_Paper.docx
@@ -4,12 +4,15 @@
   <w:body>
     <w:p>
       <w:pPr>
-        <w:spacing w:after="40"/>
+        <w:pStyle w:val="Title"/>
+        <w:spacing w:after="60"/>
         <w:jc w:val="center"/>
       </w:pPr>
       <w:r>
         <w:rPr>
+          <w:rFonts w:ascii="Times New Roman" w:hAnsi="Times New Roman"/>
           <w:b/>
+          <w:color w:val="000000"/>
           <w:sz w:val="26"/>
         </w:rPr>
         <w:t>ParkGuide AI: A Citation-Grounded Retrieval-Augmented Chatbot for U.S. National Park Visitor Information</w:t>
@@ -64,7 +67,7 @@
       <w:r>
         <w:rPr>
           <w:b/>
-          <w:color w:val="22503F"/>
+          <w:color w:val="000000"/>
           <w:sz w:val="21"/>
         </w:rPr>
         <w:t>1. System Architecture</w:t>
@@ -170,7 +173,7 @@
       <w:r>
         <w:rPr>
           <w:b/>
-          <w:color w:val="22503F"/>
+          <w:color w:val="000000"/>
           <w:sz w:val="21"/>
         </w:rPr>
         <w:t>2. Retrieval &amp; Generation Design</w:t>
@@ -240,7 +243,7 @@
       <w:r>
         <w:rPr>
           <w:b/>
-          <w:color w:val="22503F"/>
+          <w:color w:val="000000"/>
           <w:sz w:val="21"/>
         </w:rPr>
         <w:t>3. Chunking &amp; Re-Chunk Experiment</w:t>
@@ -296,7 +299,7 @@
       <w:r>
         <w:rPr>
           <w:b/>
-          <w:color w:val="22503F"/>
+          <w:color w:val="000000"/>
           <w:sz w:val="21"/>
         </w:rPr>
         <w:t>4. Version Control &amp; Team Collaboration</w:t>
@@ -859,7 +862,7 @@
       <w:r>
         <w:rPr>
           <w:b/>
-          <w:color w:val="22503F"/>
+          <w:color w:val="000000"/>
           <w:sz w:val="21"/>
         </w:rPr>
         <w:t>5. Ethics Considerations</w:t>
@@ -918,7 +921,7 @@
       <w:r>
         <w:rPr>
           <w:b/>
-          <w:color w:val="22503F"/>
+          <w:color w:val="000000"/>
           <w:sz w:val="21"/>
         </w:rPr>
         <w:t>6. Challenges &amp; Solutions</w:t>
@@ -978,92 +981,66 @@
     <w:p>
       <w:pPr>
         <w:keepNext/>
-        <w:spacing w:before="100" w:after="40"/>
-        <w:rPr>
-          <w:highlight w:val="yellow"/>
-        </w:rPr>
+        <w:pageBreakBefore w:val="0"/>
+        <w:widowControl/>
+        <w:spacing w:after="100" w:line="250" w:lineRule="auto" w:before="140"/>
       </w:pPr>
       <w:r>
         <w:rPr>
+          <w:rFonts w:ascii="Times New Roman" w:hAnsi="Times New Roman"/>
           <w:b/>
-          <w:color w:val="22503F"/>
+          <w:color w:val="000000"/>
           <w:sz w:val="21"/>
-          <w:highlight w:val="yellow"/>
         </w:rPr>
         <w:t>7. Evaluation</w:t>
       </w:r>
     </w:p>
     <w:p>
       <w:pPr>
-        <w:jc w:val="both"/>
-        <w:rPr>
-          <w:highlight w:val="yellow"/>
-        </w:rPr>
+        <w:keepNext w:val="0"/>
+        <w:widowControl/>
+        <w:spacing w:after="100" w:line="250" w:lineRule="auto"/>
       </w:pPr>
       <w:r>
         <w:rPr>
+          <w:rFonts w:ascii="Times New Roman" w:hAnsi="Times New Roman"/>
           <w:b/>
-          <w:highlight w:val="yellow"/>
+          <w:color w:val="000000"/>
+          <w:sz w:val="20"/>
         </w:rPr>
-        <w:t>Design.</w:t>
+        <w:t xml:space="preserve">Design. </w:t>
       </w:r>
       <w:r>
         <w:rPr>
-          <w:highlight w:val="yellow"/>
+          <w:rFonts w:ascii="Times New Roman" w:hAnsi="Times New Roman"/>
+          <w:color w:val="000000"/>
+          <w:sz w:val="20"/>
         </w:rPr>
-        <w:t xml:space="preserve"> The 40 gold drafts (factual 15, multi-hop 6, comparative 4, temporal 4, unanswerable 8, ambiguous/adversarial 3) were authored from saved pages before any live answers, with a planned category-stratified 24/16 dev/test split (seed 633). Reference labels came from five independent AI labelers (75 consensus facts), and a separate AI assessor graded 40 fresh responses. Baselines: </w:t>
+        <w:t>The repository contains two distinct evaluation tracks. The original course gold drafts were sealed before initial live answers, with a planned human-reviewed 24/16 development/test split (seed 633). That reviewed split and final-test benchmark remain pending. The later gold-matrix-v1 study uses revised, product-aligned candidates after development exposure; it does not inherit the original drafts' pre-output or held-out status.</w:t>
+      </w:r>
+    </w:p>
+    <w:p>
+      <w:pPr>
+        <w:keepNext w:val="0"/>
+        <w:widowControl/>
+        <w:spacing w:after="100" w:line="250" w:lineRule="auto"/>
+      </w:pPr>
+      <w:r>
+        <w:rPr>
+          <w:rFonts w:ascii="Times New Roman" w:hAnsi="Times New Roman"/>
+          <w:b/>
+          <w:color w:val="000000"/>
+          <w:sz w:val="20"/>
+        </w:rPr>
+        <w:t xml:space="preserve">Earlier retrieval experiment. </w:t>
       </w:r>
       <w:r>
         <w:rPr>
-          <w:b/>
-          <w:highlight w:val="yellow"/>
+          <w:rFonts w:ascii="Times New Roman" w:hAnsi="Times New Roman"/>
+          <w:color w:val="000000"/>
+          <w:sz w:val="20"/>
         </w:rPr>
-        <w:t>B0</w:t>
-      </w:r>
-      <w:r>
-        <w:rPr>
-          <w:highlight w:val="yellow"/>
-        </w:rPr>
-        <w:t xml:space="preserve"> closed-book model; </w:t>
-      </w:r>
-      <w:r>
-        <w:rPr>
-          <w:b/>
-          <w:highlight w:val="yellow"/>
-        </w:rPr>
-        <w:t>B1</w:t>
-      </w:r>
-      <w:r>
-        <w:rPr>
-          <w:highlight w:val="yellow"/>
-        </w:rPr>
-        <w:t xml:space="preserve"> BM25 on fixed chunks; </w:t>
-      </w:r>
-      <w:r>
-        <w:rPr>
-          <w:b/>
-          <w:highlight w:val="yellow"/>
-        </w:rPr>
-        <w:t>B2</w:t>
-      </w:r>
-      <w:r>
-        <w:rPr>
-          <w:highlight w:val="yellow"/>
-        </w:rPr>
-        <w:t xml:space="preserve"> dense on fixed chunks; </w:t>
-      </w:r>
-      <w:r>
-        <w:rPr>
-          <w:b/>
-          <w:highlight w:val="yellow"/>
-        </w:rPr>
-        <w:t>B3</w:t>
-      </w:r>
-      <w:r>
-        <w:rPr>
-          <w:highlight w:val="yellow"/>
-        </w:rPr>
-        <w:t xml:space="preserve"> structure-aware hybrid retrieval, with C1 (dense) and C2 (hybrid) as intermediate ablations. Table 1 comes from a controlled run on 12 diagnostic items (8 with source evidence) using the earlier GPT-4.1 mini generator; intervals are paired bootstrap (10,000 resamples, seed 633).</w:t>
+        <w:t>Table 1 preserves the earlier controlled comparison on 12 diagnostic items (8 with source evidence), using GPT-4.1 mini rather than the later Luna configuration. B0 is closed book; B1 and B2 use fixed chunks; C1, C2, and B3 are structure-aware retrieval ablations. Its paired intervals use 10,000 bootstrap resamples (seed 633).</w:t>
       </w:r>
     </w:p>
     <w:tbl>
@@ -1099,15 +1076,12 @@
           <w:p>
             <w:pPr>
               <w:spacing w:after="0"/>
-              <w:rPr>
-                <w:highlight w:val="yellow"/>
-              </w:rPr>
+              <w:rPr/>
             </w:pPr>
             <w:r>
               <w:rPr>
                 <w:b/>
                 <w:sz w:val="16"/>
-                <w:highlight w:val="yellow"/>
               </w:rPr>
               <w:t>Variant</w:t>
             </w:r>
@@ -1121,15 +1095,12 @@
           <w:p>
             <w:pPr>
               <w:spacing w:after="0"/>
-              <w:rPr>
-                <w:highlight w:val="yellow"/>
-              </w:rPr>
+              <w:rPr/>
             </w:pPr>
             <w:r>
               <w:rPr>
                 <w:b/>
                 <w:sz w:val="16"/>
-                <w:highlight w:val="yellow"/>
               </w:rPr>
               <w:t>Retrieval / chunking</w:t>
             </w:r>
@@ -1143,15 +1114,12 @@
           <w:p>
             <w:pPr>
               <w:spacing w:after="0"/>
-              <w:rPr>
-                <w:highlight w:val="yellow"/>
-              </w:rPr>
+              <w:rPr/>
             </w:pPr>
             <w:r>
               <w:rPr>
                 <w:b/>
                 <w:sz w:val="16"/>
-                <w:highlight w:val="yellow"/>
               </w:rPr>
               <w:t>MRR</w:t>
             </w:r>
@@ -1165,15 +1133,12 @@
           <w:p>
             <w:pPr>
               <w:spacing w:after="0"/>
-              <w:rPr>
-                <w:highlight w:val="yellow"/>
-              </w:rPr>
+              <w:rPr/>
             </w:pPr>
             <w:r>
               <w:rPr>
                 <w:b/>
                 <w:sz w:val="16"/>
-                <w:highlight w:val="yellow"/>
               </w:rPr>
               <w:t>Action agreement</w:t>
             </w:r>
@@ -1187,15 +1152,12 @@
           <w:p>
             <w:pPr>
               <w:spacing w:after="0"/>
-              <w:rPr>
-                <w:highlight w:val="yellow"/>
-              </w:rPr>
+              <w:rPr/>
             </w:pPr>
             <w:r>
               <w:rPr>
                 <w:b/>
                 <w:sz w:val="16"/>
-                <w:highlight w:val="yellow"/>
               </w:rPr>
               <w:t>Lexical pass</w:t>
             </w:r>
@@ -1213,14 +1175,11 @@
           <w:p>
             <w:pPr>
               <w:spacing w:after="0"/>
-              <w:rPr>
-                <w:highlight w:val="yellow"/>
-              </w:rPr>
+              <w:rPr/>
             </w:pPr>
             <w:r>
               <w:rPr>
                 <w:sz w:val="16"/>
-                <w:highlight w:val="yellow"/>
               </w:rPr>
               <w:t>B0</w:t>
             </w:r>
@@ -1233,14 +1192,11 @@
           <w:p>
             <w:pPr>
               <w:spacing w:after="0"/>
-              <w:rPr>
-                <w:highlight w:val="yellow"/>
-              </w:rPr>
+              <w:rPr/>
             </w:pPr>
             <w:r>
               <w:rPr>
                 <w:sz w:val="16"/>
-                <w:highlight w:val="yellow"/>
               </w:rPr>
               <w:t>No retrieval (closed book)</w:t>
             </w:r>
@@ -1253,14 +1209,11 @@
           <w:p>
             <w:pPr>
               <w:spacing w:after="0"/>
-              <w:rPr>
-                <w:highlight w:val="yellow"/>
-              </w:rPr>
+              <w:rPr/>
             </w:pPr>
             <w:r>
               <w:rPr>
                 <w:sz w:val="16"/>
-                <w:highlight w:val="yellow"/>
               </w:rPr>
               <w:t>n/a</w:t>
             </w:r>
@@ -1273,14 +1226,11 @@
           <w:p>
             <w:pPr>
               <w:spacing w:after="0"/>
-              <w:rPr>
-                <w:highlight w:val="yellow"/>
-              </w:rPr>
+              <w:rPr/>
             </w:pPr>
             <w:r>
               <w:rPr>
                 <w:sz w:val="16"/>
-                <w:highlight w:val="yellow"/>
               </w:rPr>
               <w:t>12/12</w:t>
             </w:r>
@@ -1293,14 +1243,11 @@
           <w:p>
             <w:pPr>
               <w:spacing w:after="0"/>
-              <w:rPr>
-                <w:highlight w:val="yellow"/>
-              </w:rPr>
+              <w:rPr/>
             </w:pPr>
             <w:r>
               <w:rPr>
                 <w:sz w:val="16"/>
-                <w:highlight w:val="yellow"/>
               </w:rPr>
               <w:t>2/12</w:t>
             </w:r>
@@ -1318,14 +1265,11 @@
           <w:p>
             <w:pPr>
               <w:spacing w:after="0"/>
-              <w:rPr>
-                <w:highlight w:val="yellow"/>
-              </w:rPr>
+              <w:rPr/>
             </w:pPr>
             <w:r>
               <w:rPr>
                 <w:sz w:val="16"/>
-                <w:highlight w:val="yellow"/>
               </w:rPr>
               <w:t>B1</w:t>
             </w:r>
@@ -1338,14 +1282,11 @@
           <w:p>
             <w:pPr>
               <w:spacing w:after="0"/>
-              <w:rPr>
-                <w:highlight w:val="yellow"/>
-              </w:rPr>
+              <w:rPr/>
             </w:pPr>
             <w:r>
               <w:rPr>
                 <w:sz w:val="16"/>
-                <w:highlight w:val="yellow"/>
               </w:rPr>
               <w:t>BM25, fixed</w:t>
             </w:r>
@@ -1358,14 +1299,11 @@
           <w:p>
             <w:pPr>
               <w:spacing w:after="0"/>
-              <w:rPr>
-                <w:highlight w:val="yellow"/>
-              </w:rPr>
+              <w:rPr/>
             </w:pPr>
             <w:r>
               <w:rPr>
                 <w:sz w:val="16"/>
-                <w:highlight w:val="yellow"/>
               </w:rPr>
               <w:t>0.875</w:t>
             </w:r>
@@ -1378,14 +1316,11 @@
           <w:p>
             <w:pPr>
               <w:spacing w:after="0"/>
-              <w:rPr>
-                <w:highlight w:val="yellow"/>
-              </w:rPr>
+              <w:rPr/>
             </w:pPr>
             <w:r>
               <w:rPr>
                 <w:sz w:val="16"/>
-                <w:highlight w:val="yellow"/>
               </w:rPr>
               <w:t>9/12</w:t>
             </w:r>
@@ -1398,14 +1333,11 @@
           <w:p>
             <w:pPr>
               <w:spacing w:after="0"/>
-              <w:rPr>
-                <w:highlight w:val="yellow"/>
-              </w:rPr>
+              <w:rPr/>
             </w:pPr>
             <w:r>
               <w:rPr>
                 <w:sz w:val="16"/>
-                <w:highlight w:val="yellow"/>
               </w:rPr>
               <w:t>4/12</w:t>
             </w:r>
@@ -1423,14 +1355,11 @@
           <w:p>
             <w:pPr>
               <w:spacing w:after="0"/>
-              <w:rPr>
-                <w:highlight w:val="yellow"/>
-              </w:rPr>
+              <w:rPr/>
             </w:pPr>
             <w:r>
               <w:rPr>
                 <w:sz w:val="16"/>
-                <w:highlight w:val="yellow"/>
               </w:rPr>
               <w:t>B2</w:t>
             </w:r>
@@ -1443,14 +1372,11 @@
           <w:p>
             <w:pPr>
               <w:spacing w:after="0"/>
-              <w:rPr>
-                <w:highlight w:val="yellow"/>
-              </w:rPr>
+              <w:rPr/>
             </w:pPr>
             <w:r>
               <w:rPr>
                 <w:sz w:val="16"/>
-                <w:highlight w:val="yellow"/>
               </w:rPr>
               <w:t>Dense, fixed</w:t>
             </w:r>
@@ -1463,14 +1389,11 @@
           <w:p>
             <w:pPr>
               <w:spacing w:after="0"/>
-              <w:rPr>
-                <w:highlight w:val="yellow"/>
-              </w:rPr>
+              <w:rPr/>
             </w:pPr>
             <w:r>
               <w:rPr>
                 <w:sz w:val="16"/>
-                <w:highlight w:val="yellow"/>
               </w:rPr>
               <w:t>0.550</w:t>
             </w:r>
@@ -1483,14 +1406,11 @@
           <w:p>
             <w:pPr>
               <w:spacing w:after="0"/>
-              <w:rPr>
-                <w:highlight w:val="yellow"/>
-              </w:rPr>
+              <w:rPr/>
             </w:pPr>
             <w:r>
               <w:rPr>
                 <w:sz w:val="16"/>
-                <w:highlight w:val="yellow"/>
               </w:rPr>
               <w:t>8/12</w:t>
             </w:r>
@@ -1503,14 +1423,11 @@
           <w:p>
             <w:pPr>
               <w:spacing w:after="0"/>
-              <w:rPr>
-                <w:highlight w:val="yellow"/>
-              </w:rPr>
+              <w:rPr/>
             </w:pPr>
             <w:r>
               <w:rPr>
                 <w:sz w:val="16"/>
-                <w:highlight w:val="yellow"/>
               </w:rPr>
               <w:t>3/12</w:t>
             </w:r>
@@ -1528,14 +1445,11 @@
           <w:p>
             <w:pPr>
               <w:spacing w:after="0"/>
-              <w:rPr>
-                <w:highlight w:val="yellow"/>
-              </w:rPr>
+              <w:rPr/>
             </w:pPr>
             <w:r>
               <w:rPr>
                 <w:sz w:val="16"/>
-                <w:highlight w:val="yellow"/>
               </w:rPr>
               <w:t>C1</w:t>
             </w:r>
@@ -1548,14 +1462,11 @@
           <w:p>
             <w:pPr>
               <w:spacing w:after="0"/>
-              <w:rPr>
-                <w:highlight w:val="yellow"/>
-              </w:rPr>
+              <w:rPr/>
             </w:pPr>
             <w:r>
               <w:rPr>
                 <w:sz w:val="16"/>
-                <w:highlight w:val="yellow"/>
               </w:rPr>
               <w:t>Dense, structure-aware</w:t>
             </w:r>
@@ -1568,14 +1479,11 @@
           <w:p>
             <w:pPr>
               <w:spacing w:after="0"/>
-              <w:rPr>
-                <w:highlight w:val="yellow"/>
-              </w:rPr>
+              <w:rPr/>
             </w:pPr>
             <w:r>
               <w:rPr>
                 <w:sz w:val="16"/>
-                <w:highlight w:val="yellow"/>
               </w:rPr>
               <w:t>0.854</w:t>
             </w:r>
@@ -1588,14 +1496,11 @@
           <w:p>
             <w:pPr>
               <w:spacing w:after="0"/>
-              <w:rPr>
-                <w:highlight w:val="yellow"/>
-              </w:rPr>
+              <w:rPr/>
             </w:pPr>
             <w:r>
               <w:rPr>
                 <w:sz w:val="16"/>
-                <w:highlight w:val="yellow"/>
               </w:rPr>
               <w:t>10/12</w:t>
             </w:r>
@@ -1608,14 +1513,11 @@
           <w:p>
             <w:pPr>
               <w:spacing w:after="0"/>
-              <w:rPr>
-                <w:highlight w:val="yellow"/>
-              </w:rPr>
+              <w:rPr/>
             </w:pPr>
             <w:r>
               <w:rPr>
                 <w:sz w:val="16"/>
-                <w:highlight w:val="yellow"/>
               </w:rPr>
               <w:t>6/12</w:t>
             </w:r>
@@ -1633,14 +1535,11 @@
           <w:p>
             <w:pPr>
               <w:spacing w:after="0"/>
-              <w:rPr>
-                <w:highlight w:val="yellow"/>
-              </w:rPr>
+              <w:rPr/>
             </w:pPr>
             <w:r>
               <w:rPr>
                 <w:sz w:val="16"/>
-                <w:highlight w:val="yellow"/>
               </w:rPr>
               <w:t>C2</w:t>
             </w:r>
@@ -1653,14 +1552,11 @@
           <w:p>
             <w:pPr>
               <w:spacing w:after="0"/>
-              <w:rPr>
-                <w:highlight w:val="yellow"/>
-              </w:rPr>
+              <w:rPr/>
             </w:pPr>
             <w:r>
               <w:rPr>
                 <w:sz w:val="16"/>
-                <w:highlight w:val="yellow"/>
               </w:rPr>
               <w:t>Hybrid, structure-aware</w:t>
             </w:r>
@@ -1673,14 +1569,11 @@
           <w:p>
             <w:pPr>
               <w:spacing w:after="0"/>
-              <w:rPr>
-                <w:highlight w:val="yellow"/>
-              </w:rPr>
+              <w:rPr/>
             </w:pPr>
             <w:r>
               <w:rPr>
                 <w:sz w:val="16"/>
-                <w:highlight w:val="yellow"/>
               </w:rPr>
               <w:t>0.854</w:t>
             </w:r>
@@ -1693,14 +1586,11 @@
           <w:p>
             <w:pPr>
               <w:spacing w:after="0"/>
-              <w:rPr>
-                <w:highlight w:val="yellow"/>
-              </w:rPr>
+              <w:rPr/>
             </w:pPr>
             <w:r>
               <w:rPr>
                 <w:sz w:val="16"/>
-                <w:highlight w:val="yellow"/>
               </w:rPr>
               <w:t>11/12</w:t>
             </w:r>
@@ -1713,14 +1603,11 @@
           <w:p>
             <w:pPr>
               <w:spacing w:after="0"/>
-              <w:rPr>
-                <w:highlight w:val="yellow"/>
-              </w:rPr>
+              <w:rPr/>
             </w:pPr>
             <w:r>
               <w:rPr>
                 <w:sz w:val="16"/>
-                <w:highlight w:val="yellow"/>
               </w:rPr>
               <w:t>5/12</w:t>
             </w:r>
@@ -1738,16 +1625,13 @@
           <w:p>
             <w:pPr>
               <w:spacing w:after="0"/>
-              <w:rPr>
-                <w:highlight w:val="yellow"/>
-              </w:rPr>
+              <w:rPr/>
             </w:pPr>
             <w:r>
               <w:rPr>
                 <w:sz w:val="16"/>
-                <w:highlight w:val="yellow"/>
               </w:rPr>
-              <w:t>B3 (this run)</w:t>
+              <w:t>B3 (earlier run)</w:t>
             </w:r>
           </w:p>
         </w:tc>
@@ -1758,14 +1642,11 @@
           <w:p>
             <w:pPr>
               <w:spacing w:after="0"/>
-              <w:rPr>
-                <w:highlight w:val="yellow"/>
-              </w:rPr>
+              <w:rPr/>
             </w:pPr>
             <w:r>
               <w:rPr>
                 <w:sz w:val="16"/>
-                <w:highlight w:val="yellow"/>
               </w:rPr>
               <w:t>C2 + CrossEncoder reranker</w:t>
             </w:r>
@@ -1778,14 +1659,11 @@
           <w:p>
             <w:pPr>
               <w:spacing w:after="0"/>
-              <w:rPr>
-                <w:highlight w:val="yellow"/>
-              </w:rPr>
+              <w:rPr/>
             </w:pPr>
             <w:r>
               <w:rPr>
                 <w:sz w:val="16"/>
-                <w:highlight w:val="yellow"/>
               </w:rPr>
               <w:t>0.781</w:t>
             </w:r>
@@ -1798,14 +1676,11 @@
           <w:p>
             <w:pPr>
               <w:spacing w:after="0"/>
-              <w:rPr>
-                <w:highlight w:val="yellow"/>
-              </w:rPr>
+              <w:rPr/>
             </w:pPr>
             <w:r>
               <w:rPr>
                 <w:sz w:val="16"/>
-                <w:highlight w:val="yellow"/>
               </w:rPr>
               <w:t>9/12</w:t>
             </w:r>
@@ -1818,14 +1693,11 @@
           <w:p>
             <w:pPr>
               <w:spacing w:after="0"/>
-              <w:rPr>
-                <w:highlight w:val="yellow"/>
-              </w:rPr>
+              <w:rPr/>
             </w:pPr>
             <w:r>
               <w:rPr>
                 <w:sz w:val="16"/>
-                <w:highlight w:val="yellow"/>
               </w:rPr>
               <w:t>5/12</w:t>
             </w:r>
@@ -1835,163 +1707,217 @@
     </w:tbl>
     <w:p>
       <w:pPr>
-        <w:spacing w:after="80"/>
-        <w:rPr>
-          <w:highlight w:val="yellow"/>
-        </w:rPr>
+        <w:keepNext w:val="0"/>
+        <w:widowControl/>
+        <w:spacing w:after="140" w:line="250" w:lineRule="auto"/>
       </w:pPr>
       <w:r>
         <w:rPr>
+          <w:rFonts w:ascii="Times New Roman" w:hAnsi="Times New Roman"/>
           <w:i/>
-          <w:sz w:val="16"/>
-          <w:highlight w:val="yellow"/>
+          <w:color w:val="000000"/>
+          <w:sz w:val="17"/>
         </w:rPr>
-        <w:t>Table 1. Controlled retrieval comparison (12 items). Paired MRR changes: B1 to B2 -0.325 [-0.563, -0.100]; B2 to C1 +0.304 [+0.083, +0.513]; C2 to B3 -0.073 [-0.219, +0.042]. Top-5 evidence coverage was 8/8 for every retrieval variant.</w:t>
+        <w:t>Table 1. Earlier controlled retrieval comparison. Paired MRR changes: B1 to B2 -0.325 [-0.563, -0.100]; B2 to C1 +0.304 [+0.083, +0.513]; C2 to B3 -0.073 [-0.219, +0.042]. Top-5 evidence coverage was 8/8 for every retrieval variant.</w:t>
       </w:r>
     </w:p>
     <w:p>
       <w:pPr>
-        <w:jc w:val="both"/>
-        <w:rPr>
-          <w:highlight w:val="yellow"/>
-        </w:rPr>
+        <w:keepNext w:val="0"/>
+        <w:widowControl/>
+        <w:spacing w:after="100" w:line="250" w:lineRule="auto"/>
       </w:pPr>
       <w:r>
         <w:rPr>
-          <w:highlight w:val="yellow"/>
+          <w:rFonts w:ascii="Times New Roman" w:hAnsi="Times New Roman"/>
+          <w:color w:val="000000"/>
+          <w:sz w:val="20"/>
         </w:rPr>
-        <w:t>Structure-aware chunking improved dense MRR by 0.304 with an interval above zero, and BM25 beat fixed-chunk dense search. Reranking showed no established gain (its interval includes zero) and added 340 ms mean latency (95% CI 305 to 365 ms) in the paired run, so the hosted and selected configuration leaves it off. These results rest on eight evidence items and are exploratory.</w:t>
+        <w:t>Structure-aware chunking improved dense MRR by 0.304 in this exploratory comparison. Reranking showed no established gain and added 340 ms mean latency (95% paired interval 305 to 365 ms). These eight evidence-bearing items do not establish a general advantage, and this earlier baseline comparison is separate from the 40-question study below.</w:t>
+      </w:r>
+    </w:p>
+    <w:p>
+      <w:pPr>
+        <w:keepNext/>
+        <w:pageBreakBefore/>
+        <w:widowControl/>
+        <w:spacing w:after="100" w:line="250" w:lineRule="auto" w:before="140"/>
+      </w:pPr>
+      <w:r>
+        <w:rPr>
+          <w:rFonts w:ascii="Times New Roman" w:hAnsi="Times New Roman"/>
+          <w:b/>
+          <w:color w:val="000000"/>
+          <w:sz w:val="21"/>
+        </w:rPr>
+        <w:t>7.1 Saved gold matrix outcomes</w:t>
+      </w:r>
+    </w:p>
+    <w:p>
+      <w:pPr>
+        <w:keepNext w:val="0"/>
+        <w:widowControl/>
+        <w:spacing w:after="100" w:line="250" w:lineRule="auto"/>
+      </w:pPr>
+      <w:r>
+        <w:rPr>
+          <w:rFonts w:ascii="Times New Roman" w:hAnsi="Times New Roman"/>
+          <w:b/>
+          <w:color w:val="000000"/>
+          <w:sz w:val="20"/>
+        </w:rPr>
+        <w:t xml:space="preserve">Protocol. </w:t>
+      </w:r>
+      <w:r>
+        <w:rPr>
+          <w:rFonts w:ascii="Times New Roman" w:hAnsi="Times New Roman"/>
+          <w:color w:val="000000"/>
+          <w:sz w:val="20"/>
+        </w:rPr>
+        <w:t>On 2026-10-10, local chat.answer at commit 4d3faaf completed 40/40 requests with 0 execution errors. Each request selected one park and began with empty history. The run used hybrid retrieval, no reranker, and Azure Luna (gpt-6-luna-2026-09-22), including generation and claim checks. Settings match the hosted profile; execution and latency were local, without Vercel/API/browser measurement.</w:t>
+      </w:r>
+    </w:p>
+    <w:p>
+      <w:pPr>
+        <w:keepNext w:val="0"/>
+        <w:widowControl/>
+        <w:spacing w:after="100" w:line="250" w:lineRule="auto"/>
+      </w:pPr>
+      <w:r>
+        <w:rPr>
+          <w:rFonts w:ascii="Times New Roman" w:hAnsi="Times New Roman"/>
+          <w:color w:val="000000"/>
+          <w:sz w:val="20"/>
+        </w:rPr>
+        <w:t>Five independent AI labeling configurations produced the 75-fact consensus reference for 40 questions. Candidate-category lineage is 15 factual, 6 multi-hop, 4 comparative, 4 temporal, 8 unanswerable, and 3 ambiguous/adversarial; five of the six multi-hop references use multiple pages, while PG016 resolves from one. A separate gpt-5.6-sol/high assessor graded the saved responses. Human verification and assessor calibration remain pending. No new chatbot or grading calls were made for this report revision.</w:t>
       </w:r>
     </w:p>
     <w:tbl>
       <w:tblPr>
         <w:tblStyle w:val="TableGrid"/>
-        <w:tblW w:w="0" w:type="auto"/>
+        <w:tblW w:type="auto" w:w="0"/>
         <w:jc w:val="center"/>
         <w:tblLayout w:type="fixed"/>
-        <w:tblCellMar>
-          <w:top w:w="20" w:type="dxa"/>
-          <w:left w:w="60" w:type="dxa"/>
-          <w:bottom w:w="20" w:type="dxa"/>
-          <w:right w:w="60" w:type="dxa"/>
-        </w:tblCellMar>
-        <w:tblLook w:val="04A0" w:firstRow="1" w:lastRow="0" w:firstColumn="1" w:lastColumn="0" w:noHBand="0" w:noVBand="1"/>
+        <w:tblLook w:firstColumn="1" w:firstRow="1" w:lastColumn="0" w:lastRow="0" w:noHBand="0" w:noVBand="1" w:val="04A0"/>
       </w:tblPr>
       <w:tblGrid>
-        <w:gridCol w:w="5040"/>
-        <w:gridCol w:w="2736"/>
-        <w:gridCol w:w="2304"/>
+        <w:gridCol w:w="5112"/>
+        <w:gridCol w:w="2376"/>
+        <w:gridCol w:w="2592"/>
       </w:tblGrid>
       <w:tr>
         <w:trPr>
-          <w:jc w:val="center"/>
+          <w:tblHeader/>
+          <w:cantSplit/>
         </w:trPr>
         <w:tc>
           <w:tcPr>
-            <w:tcW w:w="5040" w:type="dxa"/>
-            <w:shd w:val="clear" w:color="auto" w:fill="DDE8E2"/>
+            <w:tcW w:type="dxa" w:w="5112"/>
+            <w:vAlign w:val="center"/>
+            <w:shd w:fill="E8EEEE"/>
           </w:tcPr>
           <w:p>
             <w:pPr>
-              <w:spacing w:after="0"/>
-              <w:rPr>
-                <w:highlight w:val="yellow"/>
-              </w:rPr>
+              <w:spacing w:after="60" w:before="60" w:line="240" w:lineRule="auto"/>
+              <w:jc w:val="left"/>
             </w:pPr>
             <w:r>
               <w:rPr>
+                <w:rFonts w:ascii="Times New Roman" w:hAnsi="Times New Roman"/>
                 <w:b/>
-                <w:sz w:val="16"/>
-                <w:highlight w:val="yellow"/>
+                <w:color w:val="000000"/>
+                <w:sz w:val="18"/>
               </w:rPr>
-              <w:t>Metric (current system, 40 questions)</w:t>
+              <w:t>Measurement</w:t>
             </w:r>
           </w:p>
         </w:tc>
         <w:tc>
           <w:tcPr>
-            <w:tcW w:w="2736" w:type="dxa"/>
-            <w:shd w:val="clear" w:color="auto" w:fill="DDE8E2"/>
+            <w:tcW w:type="dxa" w:w="2376"/>
+            <w:vAlign w:val="center"/>
+            <w:shd w:fill="E8EEEE"/>
           </w:tcPr>
           <w:p>
             <w:pPr>
-              <w:spacing w:after="0"/>
-              <w:rPr>
-                <w:highlight w:val="yellow"/>
-              </w:rPr>
+              <w:spacing w:after="60" w:before="60" w:line="240" w:lineRule="auto"/>
+              <w:jc w:val="center"/>
             </w:pPr>
             <w:r>
               <w:rPr>
+                <w:rFonts w:ascii="Times New Roman" w:hAnsi="Times New Roman"/>
                 <w:b/>
-                <w:sz w:val="16"/>
-                <w:highlight w:val="yellow"/>
+                <w:color w:val="000000"/>
+                <w:sz w:val="18"/>
               </w:rPr>
-              <w:t>Result</w:t>
+              <w:t>Saved result</w:t>
             </w:r>
           </w:p>
         </w:tc>
         <w:tc>
           <w:tcPr>
-            <w:tcW w:w="2304" w:type="dxa"/>
-            <w:shd w:val="clear" w:color="auto" w:fill="DDE8E2"/>
+            <w:tcW w:type="dxa" w:w="2592"/>
+            <w:vAlign w:val="center"/>
+            <w:shd w:fill="E8EEEE"/>
           </w:tcPr>
           <w:p>
             <w:pPr>
-              <w:spacing w:after="0"/>
-              <w:rPr>
-                <w:highlight w:val="yellow"/>
-              </w:rPr>
+              <w:spacing w:after="60" w:before="60" w:line="240" w:lineRule="auto"/>
+              <w:jc w:val="center"/>
             </w:pPr>
             <w:r>
               <w:rPr>
+                <w:rFonts w:ascii="Times New Roman" w:hAnsi="Times New Roman"/>
                 <w:b/>
-                <w:sz w:val="16"/>
-                <w:highlight w:val="yellow"/>
+                <w:color w:val="000000"/>
+                <w:sz w:val="18"/>
               </w:rPr>
-              <w:t>95% Wilson CI*</w:t>
+              <w:t>Unit</w:t>
             </w:r>
           </w:p>
         </w:tc>
       </w:tr>
       <w:tr>
         <w:trPr>
-          <w:jc w:val="center"/>
+          <w:cantSplit/>
         </w:trPr>
         <w:tc>
           <w:tcPr>
-            <w:tcW w:w="5040" w:type="dxa"/>
+            <w:tcW w:type="dxa" w:w="5112"/>
+            <w:vAlign w:val="center"/>
           </w:tcPr>
           <w:p>
             <w:pPr>
-              <w:spacing w:after="0"/>
-              <w:rPr>
-                <w:highlight w:val="yellow"/>
-              </w:rPr>
+              <w:spacing w:after="60" w:before="60" w:line="240" w:lineRule="auto"/>
+              <w:jc w:val="left"/>
             </w:pPr>
             <w:r>
               <w:rPr>
-                <w:sz w:val="16"/>
-                <w:highlight w:val="yellow"/>
+                <w:rFonts w:ascii="Times New Roman" w:hAnsi="Times New Roman"/>
+                <w:b w:val="0"/>
+                <w:color w:val="000000"/>
+                <w:sz w:val="18"/>
               </w:rPr>
-              <w:t>Correct action (answer / refuse / clarify)</w:t>
+              <w:t>Correct action</w:t>
             </w:r>
           </w:p>
         </w:tc>
         <w:tc>
           <w:tcPr>
-            <w:tcW w:w="2736" w:type="dxa"/>
+            <w:tcW w:type="dxa" w:w="2376"/>
+            <w:vAlign w:val="center"/>
           </w:tcPr>
           <w:p>
             <w:pPr>
-              <w:spacing w:after="0"/>
-              <w:rPr>
-                <w:highlight w:val="yellow"/>
-              </w:rPr>
+              <w:spacing w:after="60" w:before="60" w:line="240" w:lineRule="auto"/>
+              <w:jc w:val="center"/>
             </w:pPr>
             <w:r>
               <w:rPr>
-                <w:sz w:val="16"/>
-                <w:highlight w:val="yellow"/>
+                <w:rFonts w:ascii="Times New Roman" w:hAnsi="Times New Roman"/>
+                <w:b w:val="0"/>
+                <w:color w:val="000000"/>
+                <w:sz w:val="18"/>
               </w:rPr>
               <w:t>37/40 (92.5%)</w:t>
             </w:r>
@@ -1999,64 +1925,67 @@
         </w:tc>
         <w:tc>
           <w:tcPr>
-            <w:tcW w:w="2304" w:type="dxa"/>
+            <w:tcW w:type="dxa" w:w="2592"/>
+            <w:vAlign w:val="center"/>
           </w:tcPr>
           <w:p>
             <w:pPr>
-              <w:spacing w:after="0"/>
-              <w:rPr>
-                <w:highlight w:val="yellow"/>
-              </w:rPr>
+              <w:spacing w:after="60" w:before="60" w:line="240" w:lineRule="auto"/>
+              <w:jc w:val="center"/>
             </w:pPr>
             <w:r>
               <w:rPr>
-                <w:sz w:val="16"/>
-                <w:highlight w:val="yellow"/>
+                <w:rFonts w:ascii="Times New Roman" w:hAnsi="Times New Roman"/>
+                <w:b w:val="0"/>
+                <w:color w:val="000000"/>
+                <w:sz w:val="18"/>
               </w:rPr>
-              <w:t>80.1% to 97.4%</w:t>
+              <w:t>Questions</w:t>
             </w:r>
           </w:p>
         </w:tc>
       </w:tr>
       <w:tr>
         <w:trPr>
-          <w:jc w:val="center"/>
+          <w:cantSplit/>
         </w:trPr>
         <w:tc>
           <w:tcPr>
-            <w:tcW w:w="5040" w:type="dxa"/>
+            <w:tcW w:type="dxa" w:w="5112"/>
+            <w:vAlign w:val="center"/>
           </w:tcPr>
           <w:p>
             <w:pPr>
-              <w:spacing w:after="0"/>
-              <w:rPr>
-                <w:highlight w:val="yellow"/>
-              </w:rPr>
+              <w:spacing w:after="60" w:before="60" w:line="240" w:lineRule="auto"/>
+              <w:jc w:val="left"/>
             </w:pPr>
             <w:r>
               <w:rPr>
-                <w:sz w:val="16"/>
-                <w:highlight w:val="yellow"/>
+                <w:rFonts w:ascii="Times New Roman" w:hAnsi="Times New Roman"/>
+                <w:b w:val="0"/>
+                <w:color w:val="000000"/>
+                <w:sz w:val="18"/>
               </w:rPr>
-              <w:t>Full rubric pass (AI assessed)</w:t>
+              <w:t>Full rubric pass, AI assessed</w:t>
             </w:r>
           </w:p>
         </w:tc>
         <w:tc>
           <w:tcPr>
-            <w:tcW w:w="2736" w:type="dxa"/>
+            <w:tcW w:type="dxa" w:w="2376"/>
+            <w:vAlign w:val="center"/>
           </w:tcPr>
           <w:p>
             <w:pPr>
-              <w:spacing w:after="0"/>
-              <w:rPr>
-                <w:highlight w:val="yellow"/>
-              </w:rPr>
+              <w:spacing w:after="60" w:before="60" w:line="240" w:lineRule="auto"/>
+              <w:jc w:val="center"/>
             </w:pPr>
             <w:r>
               <w:rPr>
-                <w:sz w:val="16"/>
-                <w:highlight w:val="yellow"/>
+                <w:rFonts w:ascii="Times New Roman" w:hAnsi="Times New Roman"/>
+                <w:b w:val="0"/>
+                <w:color w:val="000000"/>
+                <w:sz w:val="18"/>
               </w:rPr>
               <w:t>21/40 (52.5%)</w:t>
             </w:r>
@@ -2064,64 +1993,67 @@
         </w:tc>
         <w:tc>
           <w:tcPr>
-            <w:tcW w:w="2304" w:type="dxa"/>
+            <w:tcW w:type="dxa" w:w="2592"/>
+            <w:vAlign w:val="center"/>
           </w:tcPr>
           <w:p>
             <w:pPr>
-              <w:spacing w:after="0"/>
-              <w:rPr>
-                <w:highlight w:val="yellow"/>
-              </w:rPr>
+              <w:spacing w:after="60" w:before="60" w:line="240" w:lineRule="auto"/>
+              <w:jc w:val="center"/>
             </w:pPr>
             <w:r>
               <w:rPr>
-                <w:sz w:val="16"/>
-                <w:highlight w:val="yellow"/>
+                <w:rFonts w:ascii="Times New Roman" w:hAnsi="Times New Roman"/>
+                <w:b w:val="0"/>
+                <w:color w:val="000000"/>
+                <w:sz w:val="18"/>
               </w:rPr>
-              <w:t>37.5% to 67.1%</w:t>
+              <w:t>Questions</w:t>
             </w:r>
           </w:p>
         </w:tc>
       </w:tr>
       <w:tr>
         <w:trPr>
-          <w:jc w:val="center"/>
+          <w:cantSplit/>
         </w:trPr>
         <w:tc>
           <w:tcPr>
-            <w:tcW w:w="5040" w:type="dxa"/>
+            <w:tcW w:type="dxa" w:w="5112"/>
+            <w:vAlign w:val="center"/>
           </w:tcPr>
           <w:p>
             <w:pPr>
-              <w:spacing w:after="0"/>
-              <w:rPr>
-                <w:highlight w:val="yellow"/>
-              </w:rPr>
+              <w:spacing w:after="60" w:before="60" w:line="240" w:lineRule="auto"/>
+              <w:jc w:val="left"/>
             </w:pPr>
             <w:r>
               <w:rPr>
-                <w:sz w:val="16"/>
-                <w:highlight w:val="yellow"/>
+                <w:rFonts w:ascii="Times New Roman" w:hAnsi="Times New Roman"/>
+                <w:b w:val="0"/>
+                <w:color w:val="000000"/>
+                <w:sz w:val="18"/>
               </w:rPr>
-              <w:t>Required facts delivered (AI assessed)</w:t>
+              <w:t>Required facts delivered, AI assessed</w:t>
             </w:r>
           </w:p>
         </w:tc>
         <w:tc>
           <w:tcPr>
-            <w:tcW w:w="2736" w:type="dxa"/>
+            <w:tcW w:type="dxa" w:w="2376"/>
+            <w:vAlign w:val="center"/>
           </w:tcPr>
           <w:p>
             <w:pPr>
-              <w:spacing w:after="0"/>
-              <w:rPr>
-                <w:highlight w:val="yellow"/>
-              </w:rPr>
+              <w:spacing w:after="60" w:before="60" w:line="240" w:lineRule="auto"/>
+              <w:jc w:val="center"/>
             </w:pPr>
             <w:r>
               <w:rPr>
-                <w:sz w:val="16"/>
-                <w:highlight w:val="yellow"/>
+                <w:rFonts w:ascii="Times New Roman" w:hAnsi="Times New Roman"/>
+                <w:b w:val="0"/>
+                <w:color w:val="000000"/>
+                <w:sz w:val="18"/>
               </w:rPr>
               <w:t>55/75 (73.3%)</w:t>
             </w:r>
@@ -2129,129 +2061,271 @@
         </w:tc>
         <w:tc>
           <w:tcPr>
-            <w:tcW w:w="2304" w:type="dxa"/>
+            <w:tcW w:type="dxa" w:w="2592"/>
+            <w:vAlign w:val="center"/>
           </w:tcPr>
           <w:p>
             <w:pPr>
-              <w:spacing w:after="0"/>
-              <w:rPr>
-                <w:highlight w:val="yellow"/>
-              </w:rPr>
+              <w:spacing w:after="60" w:before="60" w:line="240" w:lineRule="auto"/>
+              <w:jc w:val="center"/>
             </w:pPr>
             <w:r>
               <w:rPr>
-                <w:sz w:val="16"/>
-                <w:highlight w:val="yellow"/>
+                <w:rFonts w:ascii="Times New Roman" w:hAnsi="Times New Roman"/>
+                <w:b w:val="0"/>
+                <w:color w:val="000000"/>
+                <w:sz w:val="18"/>
               </w:rPr>
-              <w:t>62.4% to 82.0%</w:t>
+              <w:t>Required facts</w:t>
             </w:r>
           </w:p>
         </w:tc>
       </w:tr>
       <w:tr>
         <w:trPr>
-          <w:jc w:val="center"/>
+          <w:cantSplit/>
         </w:trPr>
         <w:tc>
           <w:tcPr>
-            <w:tcW w:w="5040" w:type="dxa"/>
+            <w:tcW w:type="dxa" w:w="5112"/>
+            <w:vAlign w:val="center"/>
           </w:tcPr>
           <w:p>
             <w:pPr>
-              <w:spacing w:after="0"/>
-              <w:rPr>
-                <w:highlight w:val="yellow"/>
-              </w:rPr>
+              <w:spacing w:after="60" w:before="60" w:line="240" w:lineRule="auto"/>
+              <w:jc w:val="left"/>
             </w:pPr>
             <w:r>
               <w:rPr>
-                <w:sz w:val="16"/>
-                <w:highlight w:val="yellow"/>
+                <w:rFonts w:ascii="Times New Roman" w:hAnsi="Times New Roman"/>
+                <w:b w:val="0"/>
+                <w:color w:val="000000"/>
+                <w:sz w:val="18"/>
               </w:rPr>
-              <w:t>Delivered claims supported by cited text (AI assessed)</w:t>
+              <w:t>Behavior requirements satisfied, AI assessed</w:t>
             </w:r>
           </w:p>
         </w:tc>
         <w:tc>
           <w:tcPr>
-            <w:tcW w:w="2736" w:type="dxa"/>
+            <w:tcW w:type="dxa" w:w="2376"/>
+            <w:vAlign w:val="center"/>
           </w:tcPr>
           <w:p>
             <w:pPr>
-              <w:spacing w:after="0"/>
-              <w:rPr>
-                <w:highlight w:val="yellow"/>
-              </w:rPr>
+              <w:spacing w:after="60" w:before="60" w:line="240" w:lineRule="auto"/>
+              <w:jc w:val="center"/>
             </w:pPr>
             <w:r>
               <w:rPr>
-                <w:sz w:val="16"/>
-                <w:highlight w:val="yellow"/>
+                <w:rFonts w:ascii="Times New Roman" w:hAnsi="Times New Roman"/>
+                <w:b w:val="0"/>
+                <w:color w:val="000000"/>
+                <w:sz w:val="18"/>
               </w:rPr>
-              <w:t>40/40 (100%)</w:t>
+              <w:t>30/42 (71.4%)</w:t>
             </w:r>
           </w:p>
         </w:tc>
         <w:tc>
           <w:tcPr>
-            <w:tcW w:w="2304" w:type="dxa"/>
+            <w:tcW w:type="dxa" w:w="2592"/>
+            <w:vAlign w:val="center"/>
           </w:tcPr>
           <w:p>
             <w:pPr>
-              <w:spacing w:after="0"/>
-              <w:rPr>
-                <w:highlight w:val="yellow"/>
-              </w:rPr>
+              <w:spacing w:after="60" w:before="60" w:line="240" w:lineRule="auto"/>
+              <w:jc w:val="center"/>
             </w:pPr>
             <w:r>
               <w:rPr>
-                <w:sz w:val="16"/>
-                <w:highlight w:val="yellow"/>
+                <w:rFonts w:ascii="Times New Roman" w:hAnsi="Times New Roman"/>
+                <w:b w:val="0"/>
+                <w:color w:val="000000"/>
+                <w:sz w:val="18"/>
               </w:rPr>
-              <w:t>91.2% to 100%</w:t>
+              <w:t>Requirements</w:t>
             </w:r>
           </w:p>
         </w:tc>
       </w:tr>
       <w:tr>
         <w:trPr>
-          <w:jc w:val="center"/>
+          <w:cantSplit/>
         </w:trPr>
         <w:tc>
           <w:tcPr>
-            <w:tcW w:w="5040" w:type="dxa"/>
+            <w:tcW w:type="dxa" w:w="5112"/>
+            <w:vAlign w:val="center"/>
           </w:tcPr>
           <w:p>
             <w:pPr>
-              <w:spacing w:after="0"/>
-              <w:rPr>
-                <w:highlight w:val="yellow"/>
-              </w:rPr>
+              <w:spacing w:after="60" w:before="60" w:line="240" w:lineRule="auto"/>
+              <w:jc w:val="left"/>
             </w:pPr>
             <w:r>
               <w:rPr>
-                <w:sz w:val="16"/>
-                <w:highlight w:val="yellow"/>
+                <w:rFonts w:ascii="Times New Roman" w:hAnsi="Times New Roman"/>
+                <w:b w:val="0"/>
+                <w:color w:val="000000"/>
+                <w:sz w:val="18"/>
               </w:rPr>
-              <w:t>MRR / nDCG@10 (30 answerable)</w:t>
+              <w:t>Delivered claims supported, AI assessed</w:t>
             </w:r>
           </w:p>
         </w:tc>
         <w:tc>
           <w:tcPr>
-            <w:tcW w:w="2736" w:type="dxa"/>
+            <w:tcW w:type="dxa" w:w="2376"/>
+            <w:vAlign w:val="center"/>
           </w:tcPr>
           <w:p>
             <w:pPr>
-              <w:spacing w:after="0"/>
-              <w:rPr>
-                <w:highlight w:val="yellow"/>
-              </w:rPr>
+              <w:spacing w:after="60" w:before="60" w:line="240" w:lineRule="auto"/>
+              <w:jc w:val="center"/>
             </w:pPr>
             <w:r>
               <w:rPr>
-                <w:sz w:val="16"/>
-                <w:highlight w:val="yellow"/>
+                <w:rFonts w:ascii="Times New Roman" w:hAnsi="Times New Roman"/>
+                <w:b w:val="0"/>
+                <w:color w:val="000000"/>
+                <w:sz w:val="18"/>
+              </w:rPr>
+              <w:t>40/40 (100.0%)</w:t>
+            </w:r>
+          </w:p>
+        </w:tc>
+        <w:tc>
+          <w:tcPr>
+            <w:tcW w:type="dxa" w:w="2592"/>
+            <w:vAlign w:val="center"/>
+          </w:tcPr>
+          <w:p>
+            <w:pPr>
+              <w:spacing w:after="60" w:before="60" w:line="240" w:lineRule="auto"/>
+              <w:jc w:val="center"/>
+            </w:pPr>
+            <w:r>
+              <w:rPr>
+                <w:rFonts w:ascii="Times New Roman" w:hAnsi="Times New Roman"/>
+                <w:b w:val="0"/>
+                <w:color w:val="000000"/>
+                <w:sz w:val="18"/>
+              </w:rPr>
+              <w:t>Claims in 27 answers</w:t>
+            </w:r>
+          </w:p>
+        </w:tc>
+      </w:tr>
+      <w:tr>
+        <w:trPr>
+          <w:cantSplit/>
+        </w:trPr>
+        <w:tc>
+          <w:tcPr>
+            <w:tcW w:type="dxa" w:w="5112"/>
+            <w:vAlign w:val="center"/>
+          </w:tcPr>
+          <w:p>
+            <w:pPr>
+              <w:spacing w:after="60" w:before="60" w:line="240" w:lineRule="auto"/>
+              <w:jc w:val="left"/>
+            </w:pPr>
+            <w:r>
+              <w:rPr>
+                <w:rFonts w:ascii="Times New Roman" w:hAnsi="Times New Roman"/>
+                <w:b w:val="0"/>
+                <w:color w:val="000000"/>
+                <w:sz w:val="18"/>
+              </w:rPr>
+              <w:t>Delivered claims with valid citation identity</w:t>
+            </w:r>
+          </w:p>
+        </w:tc>
+        <w:tc>
+          <w:tcPr>
+            <w:tcW w:type="dxa" w:w="2376"/>
+            <w:vAlign w:val="center"/>
+          </w:tcPr>
+          <w:p>
+            <w:pPr>
+              <w:spacing w:after="60" w:before="60" w:line="240" w:lineRule="auto"/>
+              <w:jc w:val="center"/>
+            </w:pPr>
+            <w:r>
+              <w:rPr>
+                <w:rFonts w:ascii="Times New Roman" w:hAnsi="Times New Roman"/>
+                <w:b w:val="0"/>
+                <w:color w:val="000000"/>
+                <w:sz w:val="18"/>
+              </w:rPr>
+              <w:t>40/40 (100.0%)</w:t>
+            </w:r>
+          </w:p>
+        </w:tc>
+        <w:tc>
+          <w:tcPr>
+            <w:tcW w:type="dxa" w:w="2592"/>
+            <w:vAlign w:val="center"/>
+          </w:tcPr>
+          <w:p>
+            <w:pPr>
+              <w:spacing w:after="60" w:before="60" w:line="240" w:lineRule="auto"/>
+              <w:jc w:val="center"/>
+            </w:pPr>
+            <w:r>
+              <w:rPr>
+                <w:rFonts w:ascii="Times New Roman" w:hAnsi="Times New Roman"/>
+                <w:b w:val="0"/>
+                <w:color w:val="000000"/>
+                <w:sz w:val="18"/>
+              </w:rPr>
+              <w:t>Delivered claims</w:t>
+            </w:r>
+          </w:p>
+        </w:tc>
+      </w:tr>
+      <w:tr>
+        <w:trPr>
+          <w:cantSplit/>
+        </w:trPr>
+        <w:tc>
+          <w:tcPr>
+            <w:tcW w:type="dxa" w:w="5112"/>
+            <w:vAlign w:val="center"/>
+          </w:tcPr>
+          <w:p>
+            <w:pPr>
+              <w:spacing w:after="60" w:before="60" w:line="240" w:lineRule="auto"/>
+              <w:jc w:val="left"/>
+            </w:pPr>
+            <w:r>
+              <w:rPr>
+                <w:rFonts w:ascii="Times New Roman" w:hAnsi="Times New Roman"/>
+                <w:b w:val="0"/>
+                <w:color w:val="000000"/>
+                <w:sz w:val="18"/>
+              </w:rPr>
+              <w:t>MRR / nDCG at 10</w:t>
+            </w:r>
+          </w:p>
+        </w:tc>
+        <w:tc>
+          <w:tcPr>
+            <w:tcW w:type="dxa" w:w="2376"/>
+            <w:vAlign w:val="center"/>
+          </w:tcPr>
+          <w:p>
+            <w:pPr>
+              <w:spacing w:after="60" w:before="60" w:line="240" w:lineRule="auto"/>
+              <w:jc w:val="center"/>
+            </w:pPr>
+            <w:r>
+              <w:rPr>
+                <w:rFonts w:ascii="Times New Roman" w:hAnsi="Times New Roman"/>
+                <w:b w:val="0"/>
+                <w:color w:val="000000"/>
+                <w:sz w:val="18"/>
               </w:rPr>
               <w:t>0.794 / 0.769</w:t>
             </w:r>
@@ -2259,129 +2333,69 @@
         </w:tc>
         <w:tc>
           <w:tcPr>
-            <w:tcW w:w="2304" w:type="dxa"/>
+            <w:tcW w:type="dxa" w:w="2592"/>
+            <w:vAlign w:val="center"/>
           </w:tcPr>
           <w:p>
             <w:pPr>
-              <w:spacing w:after="0"/>
-              <w:rPr>
-                <w:highlight w:val="yellow"/>
-              </w:rPr>
+              <w:spacing w:after="60" w:before="60" w:line="240" w:lineRule="auto"/>
+              <w:jc w:val="center"/>
             </w:pPr>
             <w:r>
               <w:rPr>
-                <w:sz w:val="16"/>
-                <w:highlight w:val="yellow"/>
+                <w:rFonts w:ascii="Times New Roman" w:hAnsi="Times New Roman"/>
+                <w:b w:val="0"/>
+                <w:color w:val="000000"/>
+                <w:sz w:val="18"/>
               </w:rPr>
-              <w:t>not computed</w:t>
+              <w:t>30 answerable cases</w:t>
             </w:r>
           </w:p>
         </w:tc>
       </w:tr>
       <w:tr>
         <w:trPr>
-          <w:jc w:val="center"/>
+          <w:cantSplit/>
         </w:trPr>
         <w:tc>
           <w:tcPr>
-            <w:tcW w:w="5040" w:type="dxa"/>
+            <w:tcW w:type="dxa" w:w="5112"/>
+            <w:vAlign w:val="center"/>
           </w:tcPr>
           <w:p>
             <w:pPr>
-              <w:spacing w:after="0"/>
-              <w:rPr>
-                <w:highlight w:val="yellow"/>
-              </w:rPr>
+              <w:keepNext/>
+              <w:spacing w:after="60" w:before="60" w:line="240" w:lineRule="auto"/>
+              <w:jc w:val="left"/>
             </w:pPr>
             <w:r>
               <w:rPr>
-                <w:sz w:val="16"/>
-                <w:highlight w:val="yellow"/>
+                <w:rFonts w:ascii="Times New Roman" w:hAnsi="Times New Roman"/>
+                <w:b w:val="0"/>
+                <w:color w:val="000000"/>
+                <w:sz w:val="18"/>
               </w:rPr>
-              <w:t>Evidence coverage @5 / @20</w:t>
+              <w:t>Recorded latency p50 / p95</w:t>
             </w:r>
           </w:p>
         </w:tc>
         <w:tc>
           <w:tcPr>
-            <w:tcW w:w="2736" w:type="dxa"/>
+            <w:tcW w:type="dxa" w:w="2376"/>
+            <w:vAlign w:val="center"/>
           </w:tcPr>
           <w:p>
             <w:pPr>
-              <w:spacing w:after="0"/>
-              <w:rPr>
-                <w:highlight w:val="yellow"/>
-              </w:rPr>
+              <w:keepNext/>
+              <w:spacing w:after="60" w:before="60" w:line="240" w:lineRule="auto"/>
+              <w:jc w:val="center"/>
             </w:pPr>
             <w:r>
               <w:rPr>
-                <w:sz w:val="16"/>
-                <w:highlight w:val="yellow"/>
-              </w:rPr>
-              <w:t>84.2% / 96.7%</w:t>
-            </w:r>
-          </w:p>
-        </w:tc>
-        <w:tc>
-          <w:tcPr>
-            <w:tcW w:w="2304" w:type="dxa"/>
-          </w:tcPr>
-          <w:p>
-            <w:pPr>
-              <w:spacing w:after="0"/>
-              <w:rPr>
-                <w:highlight w:val="yellow"/>
-              </w:rPr>
-            </w:pPr>
-            <w:r>
-              <w:rPr>
-                <w:sz w:val="16"/>
-                <w:highlight w:val="yellow"/>
-              </w:rPr>
-              <w:t>not computed</w:t>
-            </w:r>
-          </w:p>
-        </w:tc>
-      </w:tr>
-      <w:tr>
-        <w:trPr>
-          <w:jc w:val="center"/>
-        </w:trPr>
-        <w:tc>
-          <w:tcPr>
-            <w:tcW w:w="5040" w:type="dxa"/>
-          </w:tcPr>
-          <w:p>
-            <w:pPr>
-              <w:spacing w:after="0"/>
-              <w:rPr>
-                <w:highlight w:val="yellow"/>
-              </w:rPr>
-            </w:pPr>
-            <w:r>
-              <w:rPr>
-                <w:sz w:val="16"/>
-                <w:highlight w:val="yellow"/>
-              </w:rPr>
-              <w:t>Latency p50 / p95</w:t>
-            </w:r>
-          </w:p>
-        </w:tc>
-        <w:tc>
-          <w:tcPr>
-            <w:tcW w:w="2736" w:type="dxa"/>
-          </w:tcPr>
-          <w:p>
-            <w:pPr>
-              <w:spacing w:after="0"/>
-              <w:rPr>
-                <w:highlight w:val="yellow"/>
-              </w:rPr>
-            </w:pPr>
-            <w:r>
-              <w:rPr>
-                <w:sz w:val="16"/>
-                <w:highlight w:val="yellow"/>
+                <w:rFonts w:ascii="Times New Roman" w:hAnsi="Times New Roman"/>
+                <w:b w:val="0"/>
+                <w:color w:val="000000"/>
+                <w:sz w:val="18"/>
               </w:rPr>
               <w:t>4.14 s / 34.92 s</w:t>
             </w:r>
@@ -2389,21 +2403,23 @@
         </w:tc>
         <w:tc>
           <w:tcPr>
-            <w:tcW w:w="2304" w:type="dxa"/>
+            <w:tcW w:type="dxa" w:w="2592"/>
+            <w:vAlign w:val="center"/>
           </w:tcPr>
           <w:p>
             <w:pPr>
-              <w:spacing w:after="0"/>
-              <w:rPr>
-                <w:highlight w:val="yellow"/>
-              </w:rPr>
+              <w:keepNext/>
+              <w:spacing w:after="60" w:before="60" w:line="240" w:lineRule="auto"/>
+              <w:jc w:val="center"/>
             </w:pPr>
             <w:r>
               <w:rPr>
-                <w:sz w:val="16"/>
-                <w:highlight w:val="yellow"/>
+                <w:rFonts w:ascii="Times New Roman" w:hAnsi="Times New Roman"/>
+                <w:b w:val="0"/>
+                <w:color w:val="000000"/>
+                <w:sz w:val="18"/>
               </w:rPr>
-              <w:t>n/a</w:t>
+              <w:t>40 local requests</w:t>
             </w:r>
           </w:p>
         </w:tc>
@@ -2411,50 +2427,1191 @@
     </w:tbl>
     <w:p>
       <w:pPr>
-        <w:spacing w:after="80"/>
-        <w:rPr>
-          <w:highlight w:val="yellow"/>
-        </w:rPr>
+        <w:keepNext w:val="0"/>
+        <w:widowControl/>
+        <w:spacing w:after="140" w:line="250" w:lineRule="auto"/>
       </w:pPr>
       <w:r>
         <w:rPr>
+          <w:rFonts w:ascii="Times New Roman" w:hAnsi="Times New Roman"/>
           <w:i/>
-          <w:sz w:val="16"/>
-          <w:highlight w:val="yellow"/>
+          <w:color w:val="000000"/>
+          <w:sz w:val="17"/>
         </w:rPr>
-        <w:t>Table 2. Hybrid retrieval, no reranker, Luna generation. *Wilson intervals computed by us from the reported counts; they treat items as independent. Items were selected with prior exposure, so this is a development diagnostic, not a held-out result.</w:t>
-      </w:r>
-    </w:p>
-    <w:p>
-      <w:pPr>
-        <w:jc w:val="both"/>
-      </w:pPr>
-      <w:r>
-        <w:rPr>
-          <w:b/>
-          <w:highlight w:val="yellow"/>
-        </w:rPr>
-        <w:t>Error analysis.</w:t>
-      </w:r>
-      <w:r>
-        <w:rPr>
-          <w:highlight w:val="yellow"/>
-        </w:rPr>
-        <w:t xml:space="preserve"> 19 of 40 responses failed the full rubric (AI-assessed): missing required facts 8 (M004, M005, M012, M014, M025, M034, M037, M039); over-refusal of answerable questions 3 (M024, M027, M036); missing or misdirected referral 3 (M011, M020, M029); missing clarification 2 (M007, M026); missing snapshot caveat 2 (M010, M013); and an inadequate source-limit explanation 1 (M031). Facts delivered (73.3%) trail evidence coverage in the generation context (84.2%), which trails coverage at 20 candidates (96.7%), so losses occur both when selecting context and when generating. Citation validity was strong, but the 3 over-refusals match the 72.7% precision on refusals</w:t>
-      </w:r>
-      <w:r>
-        <w:t>.</w:t>
+        <w:t>Table 2. Saved local end-to-end backend RAG evaluation. A full pass requires the correct action, all required facts and behaviors, supported delivered claims, and no additional answer issue; uncertain judgments do not pass.</w:t>
       </w:r>
     </w:p>
     <w:p>
       <w:pPr>
         <w:keepNext/>
-        <w:spacing w:before="100" w:after="40"/>
+        <w:widowControl/>
+        <w:spacing w:after="40" w:line="250" w:lineRule="auto"/>
+        <w:jc w:val="center"/>
       </w:pPr>
       <w:r>
         <w:rPr>
+          <w:rFonts w:ascii="Times New Roman" w:hAnsi="Times New Roman"/>
+          <w:color w:val="000000"/>
+          <w:sz w:val="20"/>
+        </w:rPr>
+      </w:r>
+      <w:r>
+        <w:drawing>
+          <wp:inline xmlns:a="http://schemas.openxmlformats.org/drawingml/2006/main" xmlns:pic="http://schemas.openxmlformats.org/drawingml/2006/picture">
+            <wp:extent cx="6035040" cy="3340826"/>
+            <wp:docPr id="2" name="Picture 2" descr="Figure 2. High action agreement and cited-claim support coexist with incomplete answers. Denominators differ by metric and are printed beside each bar. All semantic results are provisional AI assessments."/>
+            <wp:cNvGraphicFramePr>
+              <a:graphicFrameLocks noChangeAspect="1"/>
+            </wp:cNvGraphicFramePr>
+            <a:graphic>
+              <a:graphicData uri="http://schemas.openxmlformats.org/drawingml/2006/picture">
+                <pic:pic>
+                  <pic:nvPicPr>
+                    <pic:cNvPr id="0" name="outcomes.png"/>
+                    <pic:cNvPicPr/>
+                  </pic:nvPicPr>
+                  <pic:blipFill>
+                    <a:blip r:embed="rId8"/>
+                    <a:stretch>
+                      <a:fillRect/>
+                    </a:stretch>
+                  </pic:blipFill>
+                  <pic:spPr>
+                    <a:xfrm>
+                      <a:off x="0" y="0"/>
+                      <a:ext cx="6035040" cy="3340826"/>
+                    </a:xfrm>
+                    <a:prstGeom prst="rect"/>
+                  </pic:spPr>
+                </pic:pic>
+              </a:graphicData>
+            </a:graphic>
+          </wp:inline>
+        </w:drawing>
+      </w:r>
+    </w:p>
+    <w:p>
+      <w:pPr>
+        <w:keepNext w:val="0"/>
+        <w:widowControl/>
+        <w:spacing w:after="140" w:line="250" w:lineRule="auto"/>
+      </w:pPr>
+      <w:r>
+        <w:rPr>
+          <w:rFonts w:ascii="Times New Roman" w:hAnsi="Times New Roman"/>
+          <w:i/>
+          <w:color w:val="000000"/>
+          <w:sz w:val="17"/>
+        </w:rPr>
+        <w:t>Figure 2. High action agreement and cited-claim support coexist with incomplete answers. Denominators differ by metric and are printed beside each bar. All semantic results are provisional AI assessments.</w:t>
+      </w:r>
+    </w:p>
+    <w:p>
+      <w:pPr>
+        <w:keepNext w:val="0"/>
+        <w:widowControl/>
+        <w:spacing w:after="100" w:line="250" w:lineRule="auto"/>
+      </w:pPr>
+      <w:r>
+        <w:rPr>
+          <w:rFonts w:ascii="Times New Roman" w:hAnsi="Times New Roman"/>
+          <w:color w:val="000000"/>
+          <w:sz w:val="20"/>
+        </w:rPr>
+        <w:t>These descriptive rates are not population accuracy estimates. Facts and claims cluster within questions, sources overlap, and the questions have prior development exposure. Independent-observation confidence intervals would omit those dependencies and uncertainty in both the reference and assessor.</w:t>
+      </w:r>
+    </w:p>
+    <w:p>
+      <w:pPr>
+        <w:keepNext/>
+        <w:pageBreakBefore/>
+        <w:widowControl/>
+        <w:spacing w:after="100" w:line="250" w:lineRule="auto" w:before="140"/>
+      </w:pPr>
+      <w:r>
+        <w:rPr>
+          <w:rFonts w:ascii="Times New Roman" w:hAnsi="Times New Roman"/>
           <w:b/>
-          <w:color w:val="22503F"/>
+          <w:color w:val="000000"/>
+          <w:sz w:val="21"/>
+        </w:rPr>
+        <w:t>7.2 Evidence coverage and delivered information</w:t>
+      </w:r>
+    </w:p>
+    <w:p>
+      <w:pPr>
+        <w:keepNext w:val="0"/>
+        <w:widowControl/>
+        <w:spacing w:after="100" w:line="250" w:lineRule="auto"/>
+      </w:pPr>
+      <w:r>
+        <w:rPr>
+          <w:rFonts w:ascii="Times New Roman" w:hAnsi="Times New Roman"/>
+          <w:color w:val="000000"/>
+          <w:sz w:val="20"/>
+        </w:rPr>
+        <w:t>Evidence coverage asks whether retrieved source spans cover a declared evidence group for a required fact. Delivered-fact coverage asks whether the answer conveys that fact according to the AI assessor. Figure 3 uses the same 75-fact denominator for each rate, while preserving the distinction between these measurements.</w:t>
+      </w:r>
+    </w:p>
+    <w:p>
+      <w:pPr>
+        <w:keepNext/>
+        <w:widowControl/>
+        <w:spacing w:after="40" w:line="250" w:lineRule="auto"/>
+        <w:jc w:val="center"/>
+      </w:pPr>
+      <w:r>
+        <w:rPr>
+          <w:rFonts w:ascii="Times New Roman" w:hAnsi="Times New Roman"/>
+          <w:color w:val="000000"/>
+          <w:sz w:val="20"/>
+        </w:rPr>
+      </w:r>
+      <w:r>
+        <w:drawing>
+          <wp:inline xmlns:a="http://schemas.openxmlformats.org/drawingml/2006/main" xmlns:pic="http://schemas.openxmlformats.org/drawingml/2006/picture">
+            <wp:extent cx="6035040" cy="3340826"/>
+            <wp:docPr id="3" name="Picture 3" descr="Figure 3. Separate pooled measurements of declared evidence and delivered facts. These bars are not a nested funnel and their differences do not measure causal losses at successive stages."/>
+            <wp:cNvGraphicFramePr>
+              <a:graphicFrameLocks noChangeAspect="1"/>
+            </wp:cNvGraphicFramePr>
+            <a:graphic>
+              <a:graphicData uri="http://schemas.openxmlformats.org/drawingml/2006/picture">
+                <pic:pic>
+                  <pic:nvPicPr>
+                    <pic:cNvPr id="0" name="evidence-and-answer.png"/>
+                    <pic:cNvPicPr/>
+                  </pic:nvPicPr>
+                  <pic:blipFill>
+                    <a:blip r:embed="rId9"/>
+                    <a:stretch>
+                      <a:fillRect/>
+                    </a:stretch>
+                  </pic:blipFill>
+                  <pic:spPr>
+                    <a:xfrm>
+                      <a:off x="0" y="0"/>
+                      <a:ext cx="6035040" cy="3340826"/>
+                    </a:xfrm>
+                    <a:prstGeom prst="rect"/>
+                  </pic:spPr>
+                </pic:pic>
+              </a:graphicData>
+            </a:graphic>
+          </wp:inline>
+        </w:drawing>
+      </w:r>
+    </w:p>
+    <w:p>
+      <w:pPr>
+        <w:keepNext w:val="0"/>
+        <w:widowControl/>
+        <w:spacing w:after="140" w:line="250" w:lineRule="auto"/>
+      </w:pPr>
+      <w:r>
+        <w:rPr>
+          <w:rFonts w:ascii="Times New Roman" w:hAnsi="Times New Roman"/>
+          <w:i/>
+          <w:color w:val="000000"/>
+          <w:sz w:val="17"/>
+        </w:rPr>
+        <w:t>Figure 3. Separate pooled measurements of declared evidence and delivered facts. These bars are not a nested funnel and their differences do not measure causal losses at successive stages.</w:t>
+      </w:r>
+    </w:p>
+    <w:tbl>
+      <w:tblPr>
+        <w:tblStyle w:val="TableGrid"/>
+        <w:tblW w:type="auto" w:w="0"/>
+        <w:jc w:val="center"/>
+        <w:tblLayout w:type="fixed"/>
+        <w:tblLook w:firstColumn="1" w:firstRow="1" w:lastColumn="0" w:lastRow="0" w:noHBand="0" w:noVBand="1" w:val="04A0"/>
+      </w:tblPr>
+      <w:tblGrid>
+        <w:gridCol w:w="4896"/>
+        <w:gridCol w:w="2592"/>
+        <w:gridCol w:w="2592"/>
+      </w:tblGrid>
+      <w:tr>
+        <w:trPr>
+          <w:tblHeader/>
+          <w:cantSplit/>
+        </w:trPr>
+        <w:tc>
+          <w:tcPr>
+            <w:tcW w:type="dxa" w:w="4896"/>
+            <w:vAlign w:val="center"/>
+            <w:shd w:fill="E8EEEE"/>
+          </w:tcPr>
+          <w:p>
+            <w:pPr>
+              <w:spacing w:after="60" w:before="60" w:line="240" w:lineRule="auto"/>
+              <w:jc w:val="left"/>
+            </w:pPr>
+            <w:r>
+              <w:rPr>
+                <w:rFonts w:ascii="Times New Roman" w:hAnsi="Times New Roman"/>
+                <w:b/>
+                <w:color w:val="000000"/>
+                <w:sz w:val="18"/>
+              </w:rPr>
+              <w:t>Evidence measure</w:t>
+            </w:r>
+          </w:p>
+        </w:tc>
+        <w:tc>
+          <w:tcPr>
+            <w:tcW w:type="dxa" w:w="2592"/>
+            <w:vAlign w:val="center"/>
+            <w:shd w:fill="E8EEEE"/>
+          </w:tcPr>
+          <w:p>
+            <w:pPr>
+              <w:spacing w:after="60" w:before="60" w:line="240" w:lineRule="auto"/>
+              <w:jc w:val="center"/>
+            </w:pPr>
+            <w:r>
+              <w:rPr>
+                <w:rFonts w:ascii="Times New Roman" w:hAnsi="Times New Roman"/>
+                <w:b/>
+                <w:color w:val="000000"/>
+                <w:sz w:val="18"/>
+              </w:rPr>
+              <w:t>Pooled facts</w:t>
+            </w:r>
+          </w:p>
+        </w:tc>
+        <w:tc>
+          <w:tcPr>
+            <w:tcW w:type="dxa" w:w="2592"/>
+            <w:vAlign w:val="center"/>
+            <w:shd w:fill="E8EEEE"/>
+          </w:tcPr>
+          <w:p>
+            <w:pPr>
+              <w:spacing w:after="60" w:before="60" w:line="240" w:lineRule="auto"/>
+              <w:jc w:val="center"/>
+            </w:pPr>
+            <w:r>
+              <w:rPr>
+                <w:rFonts w:ascii="Times New Roman" w:hAnsi="Times New Roman"/>
+                <w:b/>
+                <w:color w:val="000000"/>
+                <w:sz w:val="18"/>
+              </w:rPr>
+              <w:t>Mean per question</w:t>
+            </w:r>
+          </w:p>
+        </w:tc>
+      </w:tr>
+      <w:tr>
+        <w:trPr>
+          <w:cantSplit/>
+        </w:trPr>
+        <w:tc>
+          <w:tcPr>
+            <w:tcW w:type="dxa" w:w="4896"/>
+            <w:vAlign w:val="center"/>
+          </w:tcPr>
+          <w:p>
+            <w:pPr>
+              <w:spacing w:after="60" w:before="60" w:line="240" w:lineRule="auto"/>
+              <w:jc w:val="left"/>
+            </w:pPr>
+            <w:r>
+              <w:rPr>
+                <w:rFonts w:ascii="Times New Roman" w:hAnsi="Times New Roman"/>
+                <w:b w:val="0"/>
+                <w:color w:val="000000"/>
+                <w:sz w:val="18"/>
+              </w:rPr>
+              <w:t>Top 5 ranked candidates</w:t>
+            </w:r>
+          </w:p>
+        </w:tc>
+        <w:tc>
+          <w:tcPr>
+            <w:tcW w:type="dxa" w:w="2592"/>
+            <w:vAlign w:val="center"/>
+          </w:tcPr>
+          <w:p>
+            <w:pPr>
+              <w:spacing w:after="60" w:before="60" w:line="240" w:lineRule="auto"/>
+              <w:jc w:val="center"/>
+            </w:pPr>
+            <w:r>
+              <w:rPr>
+                <w:rFonts w:ascii="Times New Roman" w:hAnsi="Times New Roman"/>
+                <w:b w:val="0"/>
+                <w:color w:val="000000"/>
+                <w:sz w:val="18"/>
+              </w:rPr>
+              <w:t>63/75 (84.0%)</w:t>
+            </w:r>
+          </w:p>
+        </w:tc>
+        <w:tc>
+          <w:tcPr>
+            <w:tcW w:type="dxa" w:w="2592"/>
+            <w:vAlign w:val="center"/>
+          </w:tcPr>
+          <w:p>
+            <w:pPr>
+              <w:spacing w:after="60" w:before="60" w:line="240" w:lineRule="auto"/>
+              <w:jc w:val="center"/>
+            </w:pPr>
+            <w:r>
+              <w:rPr>
+                <w:rFonts w:ascii="Times New Roman" w:hAnsi="Times New Roman"/>
+                <w:b w:val="0"/>
+                <w:color w:val="000000"/>
+                <w:sz w:val="18"/>
+              </w:rPr>
+              <w:t>84.2%</w:t>
+            </w:r>
+          </w:p>
+        </w:tc>
+      </w:tr>
+      <w:tr>
+        <w:trPr>
+          <w:cantSplit/>
+        </w:trPr>
+        <w:tc>
+          <w:tcPr>
+            <w:tcW w:type="dxa" w:w="4896"/>
+            <w:vAlign w:val="center"/>
+          </w:tcPr>
+          <w:p>
+            <w:pPr>
+              <w:spacing w:after="60" w:before="60" w:line="240" w:lineRule="auto"/>
+              <w:jc w:val="left"/>
+            </w:pPr>
+            <w:r>
+              <w:rPr>
+                <w:rFonts w:ascii="Times New Roman" w:hAnsi="Times New Roman"/>
+                <w:b w:val="0"/>
+                <w:color w:val="000000"/>
+                <w:sz w:val="18"/>
+              </w:rPr>
+              <w:t>Top 20 ranked candidates</w:t>
+            </w:r>
+          </w:p>
+        </w:tc>
+        <w:tc>
+          <w:tcPr>
+            <w:tcW w:type="dxa" w:w="2592"/>
+            <w:vAlign w:val="center"/>
+          </w:tcPr>
+          <w:p>
+            <w:pPr>
+              <w:spacing w:after="60" w:before="60" w:line="240" w:lineRule="auto"/>
+              <w:jc w:val="center"/>
+            </w:pPr>
+            <w:r>
+              <w:rPr>
+                <w:rFonts w:ascii="Times New Roman" w:hAnsi="Times New Roman"/>
+                <w:b w:val="0"/>
+                <w:color w:val="000000"/>
+                <w:sz w:val="18"/>
+              </w:rPr>
+              <w:t>72/75 (96.0%)</w:t>
+            </w:r>
+          </w:p>
+        </w:tc>
+        <w:tc>
+          <w:tcPr>
+            <w:tcW w:type="dxa" w:w="2592"/>
+            <w:vAlign w:val="center"/>
+          </w:tcPr>
+          <w:p>
+            <w:pPr>
+              <w:spacing w:after="60" w:before="60" w:line="240" w:lineRule="auto"/>
+              <w:jc w:val="center"/>
+            </w:pPr>
+            <w:r>
+              <w:rPr>
+                <w:rFonts w:ascii="Times New Roman" w:hAnsi="Times New Roman"/>
+                <w:b w:val="0"/>
+                <w:color w:val="000000"/>
+                <w:sz w:val="18"/>
+              </w:rPr>
+              <w:t>96.7%</w:t>
+            </w:r>
+          </w:p>
+        </w:tc>
+      </w:tr>
+      <w:tr>
+        <w:trPr>
+          <w:cantSplit/>
+        </w:trPr>
+        <w:tc>
+          <w:tcPr>
+            <w:tcW w:type="dxa" w:w="4896"/>
+            <w:vAlign w:val="center"/>
+          </w:tcPr>
+          <w:p>
+            <w:pPr>
+              <w:keepNext/>
+              <w:spacing w:after="60" w:before="60" w:line="240" w:lineRule="auto"/>
+              <w:jc w:val="left"/>
+            </w:pPr>
+            <w:r>
+              <w:rPr>
+                <w:rFonts w:ascii="Times New Roman" w:hAnsi="Times New Roman"/>
+                <w:b w:val="0"/>
+                <w:color w:val="000000"/>
+                <w:sz w:val="18"/>
+              </w:rPr>
+              <w:t>Actual generation contexts</w:t>
+            </w:r>
+          </w:p>
+        </w:tc>
+        <w:tc>
+          <w:tcPr>
+            <w:tcW w:type="dxa" w:w="2592"/>
+            <w:vAlign w:val="center"/>
+          </w:tcPr>
+          <w:p>
+            <w:pPr>
+              <w:keepNext/>
+              <w:spacing w:after="60" w:before="60" w:line="240" w:lineRule="auto"/>
+              <w:jc w:val="center"/>
+            </w:pPr>
+            <w:r>
+              <w:rPr>
+                <w:rFonts w:ascii="Times New Roman" w:hAnsi="Times New Roman"/>
+                <w:b w:val="0"/>
+                <w:color w:val="000000"/>
+                <w:sz w:val="18"/>
+              </w:rPr>
+              <w:t>63/75 (84.0%)</w:t>
+            </w:r>
+          </w:p>
+        </w:tc>
+        <w:tc>
+          <w:tcPr>
+            <w:tcW w:type="dxa" w:w="2592"/>
+            <w:vAlign w:val="center"/>
+          </w:tcPr>
+          <w:p>
+            <w:pPr>
+              <w:keepNext/>
+              <w:spacing w:after="60" w:before="60" w:line="240" w:lineRule="auto"/>
+              <w:jc w:val="center"/>
+            </w:pPr>
+            <w:r>
+              <w:rPr>
+                <w:rFonts w:ascii="Times New Roman" w:hAnsi="Times New Roman"/>
+                <w:b w:val="0"/>
+                <w:color w:val="000000"/>
+                <w:sz w:val="18"/>
+              </w:rPr>
+              <w:t>84.2%</w:t>
+            </w:r>
+          </w:p>
+        </w:tc>
+      </w:tr>
+    </w:tbl>
+    <w:p>
+      <w:pPr>
+        <w:keepNext w:val="0"/>
+        <w:widowControl/>
+        <w:spacing w:after="140" w:line="250" w:lineRule="auto"/>
+      </w:pPr>
+      <w:r>
+        <w:rPr>
+          <w:rFonts w:ascii="Times New Roman" w:hAnsi="Times New Roman"/>
+          <w:i/>
+          <w:color w:val="000000"/>
+          <w:sz w:val="17"/>
+        </w:rPr>
+        <w:t>Table 3. Pooled rates count 75 required facts; per-question means give equal weight to each of the 30 answerable cases. Top-k ranks precede context pruning. The two aggregations answer different questions.</w:t>
+      </w:r>
+    </w:p>
+    <w:p>
+      <w:pPr>
+        <w:keepNext w:val="0"/>
+        <w:widowControl/>
+        <w:spacing w:after="100" w:line="250" w:lineRule="auto"/>
+      </w:pPr>
+      <w:r>
+        <w:rPr>
+          <w:rFonts w:ascii="Times New Roman" w:hAnsi="Times New Roman"/>
+          <w:b/>
+          <w:color w:val="000000"/>
+          <w:sz w:val="20"/>
+        </w:rPr>
+        <w:t xml:space="preserve">Interpretation. </w:t>
+      </w:r>
+      <w:r>
+        <w:rPr>
+          <w:rFonts w:ascii="Times New Roman" w:hAnsi="Times New Roman"/>
+          <w:color w:val="000000"/>
+          <w:sz w:val="20"/>
+        </w:rPr>
+        <w:t>Four facts judged delivered lack complete declared evidence-group coverage in the actual contexts: M008 F1, M010 F1/F2, and M034 F1. Declared alternatives are not exhaustive human relevance judgments, so this mismatch alone does not demonstrate unsupported content. A per-fact review of source spans and semantic labels is needed before attributing errors to context selection or generation.</w:t>
+      </w:r>
+    </w:p>
+    <w:p>
+      <w:pPr>
+        <w:keepNext w:val="0"/>
+        <w:widowControl/>
+        <w:spacing w:after="100" w:line="250" w:lineRule="auto"/>
+      </w:pPr>
+      <w:r>
+        <w:rPr>
+          <w:rFonts w:ascii="Times New Roman" w:hAnsi="Times New Roman"/>
+          <w:b/>
+          <w:color w:val="000000"/>
+          <w:sz w:val="20"/>
+        </w:rPr>
+        <w:t xml:space="preserve">Chunk retrieval. </w:t>
+      </w:r>
+      <w:r>
+        <w:rPr>
+          <w:rFonts w:ascii="Times New Roman" w:hAnsi="Times New Roman"/>
+          <w:color w:val="000000"/>
+          <w:sz w:val="20"/>
+        </w:rPr>
+        <w:t>At rank 5, 35/150 returned chunks match declared relevance and 35/44 known relevant chunks are recovered: micro precision 23.3%, recall 79.5%, F1 36.1%. At rank 20 the corresponding counts are 43/600 and 43/44, yielding 7.2%, 97.7%, and 13.4%. These chunk metrics differ from required-fact coverage; the same fact can have several supporting chunks.</w:t>
+      </w:r>
+    </w:p>
+    <w:p>
+      <w:pPr>
+        <w:keepNext/>
+        <w:pageBreakBefore/>
+        <w:widowControl/>
+        <w:spacing w:after="100" w:line="250" w:lineRule="auto" w:before="140"/>
+      </w:pPr>
+      <w:r>
+        <w:rPr>
+          <w:rFonts w:ascii="Times New Roman" w:hAnsi="Times New Roman"/>
+          <w:b/>
+          <w:color w:val="000000"/>
+          <w:sz w:val="21"/>
+        </w:rPr>
+        <w:t>7.3 Action errors and incomplete responses</w:t>
+      </w:r>
+    </w:p>
+    <w:p>
+      <w:pPr>
+        <w:keepNext/>
+        <w:widowControl/>
+        <w:spacing w:after="40" w:line="250" w:lineRule="auto"/>
+        <w:jc w:val="center"/>
+      </w:pPr>
+      <w:r>
+        <w:rPr>
+          <w:rFonts w:ascii="Times New Roman" w:hAnsi="Times New Roman"/>
+          <w:color w:val="000000"/>
+          <w:sz w:val="20"/>
+        </w:rPr>
+      </w:r>
+      <w:r>
+        <w:drawing>
+          <wp:inline xmlns:a="http://schemas.openxmlformats.org/drawingml/2006/main" xmlns:pic="http://schemas.openxmlformats.org/drawingml/2006/picture">
+            <wp:extent cx="4297680" cy="3193415"/>
+            <wp:docPr id="4" name="Picture 4" descr="Figure 4. Expected versus observed actions for all 40 questions. The three disagreements are over-refusals of answerable questions. This action classification does not measure all requirements of the response."/>
+            <wp:cNvGraphicFramePr>
+              <a:graphicFrameLocks noChangeAspect="1"/>
+            </wp:cNvGraphicFramePr>
+            <a:graphic>
+              <a:graphicData uri="http://schemas.openxmlformats.org/drawingml/2006/picture">
+                <pic:pic>
+                  <pic:nvPicPr>
+                    <pic:cNvPr id="0" name="action-confusion.png"/>
+                    <pic:cNvPicPr/>
+                  </pic:nvPicPr>
+                  <pic:blipFill>
+                    <a:blip r:embed="rId10"/>
+                    <a:stretch>
+                      <a:fillRect/>
+                    </a:stretch>
+                  </pic:blipFill>
+                  <pic:spPr>
+                    <a:xfrm>
+                      <a:off x="0" y="0"/>
+                      <a:ext cx="4297680" cy="3193415"/>
+                    </a:xfrm>
+                    <a:prstGeom prst="rect"/>
+                  </pic:spPr>
+                </pic:pic>
+              </a:graphicData>
+            </a:graphic>
+          </wp:inline>
+        </w:drawing>
+      </w:r>
+    </w:p>
+    <w:p>
+      <w:pPr>
+        <w:keepNext w:val="0"/>
+        <w:widowControl/>
+        <w:spacing w:after="140" w:line="250" w:lineRule="auto"/>
+      </w:pPr>
+      <w:r>
+        <w:rPr>
+          <w:rFonts w:ascii="Times New Roman" w:hAnsi="Times New Roman"/>
+          <w:i/>
+          <w:color w:val="000000"/>
+          <w:sz w:val="17"/>
+        </w:rPr>
+        <w:t>Figure 4. Expected versus observed actions for all 40 questions. The three disagreements are over-refusals of answerable questions. This action classification does not measure all requirements of the response.</w:t>
+      </w:r>
+    </w:p>
+    <w:p>
+      <w:pPr>
+        <w:keepNext w:val="0"/>
+        <w:widowControl/>
+        <w:spacing w:after="100" w:line="250" w:lineRule="auto"/>
+      </w:pPr>
+      <w:r>
+        <w:rPr>
+          <w:rFonts w:ascii="Times New Roman" w:hAnsi="Times New Roman"/>
+          <w:color w:val="000000"/>
+          <w:sz w:val="20"/>
+        </w:rPr>
+        <w:t>Answer recall is 90.0%; refusal precision is 72.7%. All eight expected refusals and both expected clarifications received their expected action. Full rubric compliance is lower because missing facts, referrals, clarifying behavior, and caveats also matter. Action micro precision, recall, and F1 are each 92.5%; macro F1 is 93.0%.</w:t>
+      </w:r>
+    </w:p>
+    <w:tbl>
+      <w:tblPr>
+        <w:tblStyle w:val="TableGrid"/>
+        <w:tblW w:type="auto" w:w="0"/>
+        <w:jc w:val="center"/>
+        <w:tblLayout w:type="fixed"/>
+        <w:tblLook w:firstColumn="1" w:firstRow="1" w:lastColumn="0" w:lastRow="0" w:noHBand="0" w:noVBand="1" w:val="04A0"/>
+      </w:tblPr>
+      <w:tblGrid>
+        <w:gridCol w:w="3600"/>
+        <w:gridCol w:w="792"/>
+        <w:gridCol w:w="5688"/>
+      </w:tblGrid>
+      <w:tr>
+        <w:trPr>
+          <w:tblHeader/>
+          <w:cantSplit/>
+        </w:trPr>
+        <w:tc>
+          <w:tcPr>
+            <w:tcW w:type="dxa" w:w="3600"/>
+            <w:vAlign w:val="center"/>
+            <w:shd w:fill="E8EEEE"/>
+          </w:tcPr>
+          <w:p>
+            <w:pPr>
+              <w:spacing w:after="60" w:before="60" w:line="240" w:lineRule="auto"/>
+              <w:jc w:val="left"/>
+            </w:pPr>
+            <w:r>
+              <w:rPr>
+                <w:rFonts w:ascii="Times New Roman" w:hAnsi="Times New Roman"/>
+                <w:b/>
+                <w:color w:val="000000"/>
+                <w:sz w:val="18"/>
+              </w:rPr>
+              <w:t>Primary issue</w:t>
+            </w:r>
+          </w:p>
+        </w:tc>
+        <w:tc>
+          <w:tcPr>
+            <w:tcW w:type="dxa" w:w="792"/>
+            <w:vAlign w:val="center"/>
+            <w:shd w:fill="E8EEEE"/>
+          </w:tcPr>
+          <w:p>
+            <w:pPr>
+              <w:spacing w:after="60" w:before="60" w:line="240" w:lineRule="auto"/>
+              <w:jc w:val="center"/>
+            </w:pPr>
+            <w:r>
+              <w:rPr>
+                <w:rFonts w:ascii="Times New Roman" w:hAnsi="Times New Roman"/>
+                <w:b/>
+                <w:color w:val="000000"/>
+                <w:sz w:val="18"/>
+              </w:rPr>
+              <w:t>Cases</w:t>
+            </w:r>
+          </w:p>
+        </w:tc>
+        <w:tc>
+          <w:tcPr>
+            <w:tcW w:type="dxa" w:w="5688"/>
+            <w:vAlign w:val="center"/>
+            <w:shd w:fill="E8EEEE"/>
+          </w:tcPr>
+          <w:p>
+            <w:pPr>
+              <w:spacing w:after="60" w:before="60" w:line="240" w:lineRule="auto"/>
+              <w:jc w:val="center"/>
+            </w:pPr>
+            <w:r>
+              <w:rPr>
+                <w:rFonts w:ascii="Times New Roman" w:hAnsi="Times New Roman"/>
+                <w:b/>
+                <w:color w:val="000000"/>
+                <w:sz w:val="18"/>
+              </w:rPr>
+              <w:t>Case IDs</w:t>
+            </w:r>
+          </w:p>
+        </w:tc>
+      </w:tr>
+      <w:tr>
+        <w:trPr>
+          <w:cantSplit/>
+        </w:trPr>
+        <w:tc>
+          <w:tcPr>
+            <w:tcW w:type="dxa" w:w="3600"/>
+            <w:vAlign w:val="center"/>
+          </w:tcPr>
+          <w:p>
+            <w:pPr>
+              <w:spacing w:after="60" w:before="60" w:line="240" w:lineRule="auto"/>
+              <w:jc w:val="left"/>
+            </w:pPr>
+            <w:r>
+              <w:rPr>
+                <w:rFonts w:ascii="Times New Roman" w:hAnsi="Times New Roman"/>
+                <w:b w:val="0"/>
+                <w:color w:val="000000"/>
+                <w:sz w:val="18"/>
+              </w:rPr>
+              <w:t>Missing required facts</w:t>
+            </w:r>
+          </w:p>
+        </w:tc>
+        <w:tc>
+          <w:tcPr>
+            <w:tcW w:type="dxa" w:w="792"/>
+            <w:vAlign w:val="center"/>
+          </w:tcPr>
+          <w:p>
+            <w:pPr>
+              <w:spacing w:after="60" w:before="60" w:line="240" w:lineRule="auto"/>
+              <w:jc w:val="center"/>
+            </w:pPr>
+            <w:r>
+              <w:rPr>
+                <w:rFonts w:ascii="Times New Roman" w:hAnsi="Times New Roman"/>
+                <w:b w:val="0"/>
+                <w:color w:val="000000"/>
+                <w:sz w:val="18"/>
+              </w:rPr>
+              <w:t>8</w:t>
+            </w:r>
+          </w:p>
+        </w:tc>
+        <w:tc>
+          <w:tcPr>
+            <w:tcW w:type="dxa" w:w="5688"/>
+            <w:vAlign w:val="center"/>
+          </w:tcPr>
+          <w:p>
+            <w:pPr>
+              <w:spacing w:after="60" w:before="60" w:line="240" w:lineRule="auto"/>
+              <w:jc w:val="center"/>
+            </w:pPr>
+            <w:r>
+              <w:rPr>
+                <w:rFonts w:ascii="Times New Roman" w:hAnsi="Times New Roman"/>
+                <w:b w:val="0"/>
+                <w:color w:val="000000"/>
+                <w:sz w:val="18"/>
+              </w:rPr>
+              <w:t>M004, M005, M012, M014, M025, M034, M037, M039</w:t>
+            </w:r>
+          </w:p>
+        </w:tc>
+      </w:tr>
+      <w:tr>
+        <w:trPr>
+          <w:cantSplit/>
+        </w:trPr>
+        <w:tc>
+          <w:tcPr>
+            <w:tcW w:type="dxa" w:w="3600"/>
+            <w:vAlign w:val="center"/>
+          </w:tcPr>
+          <w:p>
+            <w:pPr>
+              <w:spacing w:after="60" w:before="60" w:line="240" w:lineRule="auto"/>
+              <w:jc w:val="left"/>
+            </w:pPr>
+            <w:r>
+              <w:rPr>
+                <w:rFonts w:ascii="Times New Roman" w:hAnsi="Times New Roman"/>
+                <w:b w:val="0"/>
+                <w:color w:val="000000"/>
+                <w:sz w:val="18"/>
+              </w:rPr>
+              <w:t>Over-refusal</w:t>
+            </w:r>
+          </w:p>
+        </w:tc>
+        <w:tc>
+          <w:tcPr>
+            <w:tcW w:type="dxa" w:w="792"/>
+            <w:vAlign w:val="center"/>
+          </w:tcPr>
+          <w:p>
+            <w:pPr>
+              <w:spacing w:after="60" w:before="60" w:line="240" w:lineRule="auto"/>
+              <w:jc w:val="center"/>
+            </w:pPr>
+            <w:r>
+              <w:rPr>
+                <w:rFonts w:ascii="Times New Roman" w:hAnsi="Times New Roman"/>
+                <w:b w:val="0"/>
+                <w:color w:val="000000"/>
+                <w:sz w:val="18"/>
+              </w:rPr>
+              <w:t>3</w:t>
+            </w:r>
+          </w:p>
+        </w:tc>
+        <w:tc>
+          <w:tcPr>
+            <w:tcW w:type="dxa" w:w="5688"/>
+            <w:vAlign w:val="center"/>
+          </w:tcPr>
+          <w:p>
+            <w:pPr>
+              <w:spacing w:after="60" w:before="60" w:line="240" w:lineRule="auto"/>
+              <w:jc w:val="center"/>
+            </w:pPr>
+            <w:r>
+              <w:rPr>
+                <w:rFonts w:ascii="Times New Roman" w:hAnsi="Times New Roman"/>
+                <w:b w:val="0"/>
+                <w:color w:val="000000"/>
+                <w:sz w:val="18"/>
+              </w:rPr>
+              <w:t>M024, M027, M036</w:t>
+            </w:r>
+          </w:p>
+        </w:tc>
+      </w:tr>
+      <w:tr>
+        <w:trPr>
+          <w:cantSplit/>
+        </w:trPr>
+        <w:tc>
+          <w:tcPr>
+            <w:tcW w:type="dxa" w:w="3600"/>
+            <w:vAlign w:val="center"/>
+          </w:tcPr>
+          <w:p>
+            <w:pPr>
+              <w:spacing w:after="60" w:before="60" w:line="240" w:lineRule="auto"/>
+              <w:jc w:val="left"/>
+            </w:pPr>
+            <w:r>
+              <w:rPr>
+                <w:rFonts w:ascii="Times New Roman" w:hAnsi="Times New Roman"/>
+                <w:b w:val="0"/>
+                <w:color w:val="000000"/>
+                <w:sz w:val="18"/>
+              </w:rPr>
+              <w:t>Missing or misdirected referral</w:t>
+            </w:r>
+          </w:p>
+        </w:tc>
+        <w:tc>
+          <w:tcPr>
+            <w:tcW w:type="dxa" w:w="792"/>
+            <w:vAlign w:val="center"/>
+          </w:tcPr>
+          <w:p>
+            <w:pPr>
+              <w:spacing w:after="60" w:before="60" w:line="240" w:lineRule="auto"/>
+              <w:jc w:val="center"/>
+            </w:pPr>
+            <w:r>
+              <w:rPr>
+                <w:rFonts w:ascii="Times New Roman" w:hAnsi="Times New Roman"/>
+                <w:b w:val="0"/>
+                <w:color w:val="000000"/>
+                <w:sz w:val="18"/>
+              </w:rPr>
+              <w:t>3</w:t>
+            </w:r>
+          </w:p>
+        </w:tc>
+        <w:tc>
+          <w:tcPr>
+            <w:tcW w:type="dxa" w:w="5688"/>
+            <w:vAlign w:val="center"/>
+          </w:tcPr>
+          <w:p>
+            <w:pPr>
+              <w:spacing w:after="60" w:before="60" w:line="240" w:lineRule="auto"/>
+              <w:jc w:val="center"/>
+            </w:pPr>
+            <w:r>
+              <w:rPr>
+                <w:rFonts w:ascii="Times New Roman" w:hAnsi="Times New Roman"/>
+                <w:b w:val="0"/>
+                <w:color w:val="000000"/>
+                <w:sz w:val="18"/>
+              </w:rPr>
+              <w:t>M011, M020, M029</w:t>
+            </w:r>
+          </w:p>
+        </w:tc>
+      </w:tr>
+      <w:tr>
+        <w:trPr>
+          <w:cantSplit/>
+        </w:trPr>
+        <w:tc>
+          <w:tcPr>
+            <w:tcW w:type="dxa" w:w="3600"/>
+            <w:vAlign w:val="center"/>
+          </w:tcPr>
+          <w:p>
+            <w:pPr>
+              <w:spacing w:after="60" w:before="60" w:line="240" w:lineRule="auto"/>
+              <w:jc w:val="left"/>
+            </w:pPr>
+            <w:r>
+              <w:rPr>
+                <w:rFonts w:ascii="Times New Roman" w:hAnsi="Times New Roman"/>
+                <w:b w:val="0"/>
+                <w:color w:val="000000"/>
+                <w:sz w:val="18"/>
+              </w:rPr>
+              <w:t>Missing clarifying behavior</w:t>
+            </w:r>
+          </w:p>
+        </w:tc>
+        <w:tc>
+          <w:tcPr>
+            <w:tcW w:type="dxa" w:w="792"/>
+            <w:vAlign w:val="center"/>
+          </w:tcPr>
+          <w:p>
+            <w:pPr>
+              <w:spacing w:after="60" w:before="60" w:line="240" w:lineRule="auto"/>
+              <w:jc w:val="center"/>
+            </w:pPr>
+            <w:r>
+              <w:rPr>
+                <w:rFonts w:ascii="Times New Roman" w:hAnsi="Times New Roman"/>
+                <w:b w:val="0"/>
+                <w:color w:val="000000"/>
+                <w:sz w:val="18"/>
+              </w:rPr>
+              <w:t>2</w:t>
+            </w:r>
+          </w:p>
+        </w:tc>
+        <w:tc>
+          <w:tcPr>
+            <w:tcW w:type="dxa" w:w="5688"/>
+            <w:vAlign w:val="center"/>
+          </w:tcPr>
+          <w:p>
+            <w:pPr>
+              <w:spacing w:after="60" w:before="60" w:line="240" w:lineRule="auto"/>
+              <w:jc w:val="center"/>
+            </w:pPr>
+            <w:r>
+              <w:rPr>
+                <w:rFonts w:ascii="Times New Roman" w:hAnsi="Times New Roman"/>
+                <w:b w:val="0"/>
+                <w:color w:val="000000"/>
+                <w:sz w:val="18"/>
+              </w:rPr>
+              <w:t>M007, M026</w:t>
+            </w:r>
+          </w:p>
+        </w:tc>
+      </w:tr>
+      <w:tr>
+        <w:trPr>
+          <w:cantSplit/>
+        </w:trPr>
+        <w:tc>
+          <w:tcPr>
+            <w:tcW w:type="dxa" w:w="3600"/>
+            <w:vAlign w:val="center"/>
+          </w:tcPr>
+          <w:p>
+            <w:pPr>
+              <w:spacing w:after="60" w:before="60" w:line="240" w:lineRule="auto"/>
+              <w:jc w:val="left"/>
+            </w:pPr>
+            <w:r>
+              <w:rPr>
+                <w:rFonts w:ascii="Times New Roman" w:hAnsi="Times New Roman"/>
+                <w:b w:val="0"/>
+                <w:color w:val="000000"/>
+                <w:sz w:val="18"/>
+              </w:rPr>
+              <w:t>Missing snapshot caveat</w:t>
+            </w:r>
+          </w:p>
+        </w:tc>
+        <w:tc>
+          <w:tcPr>
+            <w:tcW w:type="dxa" w:w="792"/>
+            <w:vAlign w:val="center"/>
+          </w:tcPr>
+          <w:p>
+            <w:pPr>
+              <w:spacing w:after="60" w:before="60" w:line="240" w:lineRule="auto"/>
+              <w:jc w:val="center"/>
+            </w:pPr>
+            <w:r>
+              <w:rPr>
+                <w:rFonts w:ascii="Times New Roman" w:hAnsi="Times New Roman"/>
+                <w:b w:val="0"/>
+                <w:color w:val="000000"/>
+                <w:sz w:val="18"/>
+              </w:rPr>
+              <w:t>2</w:t>
+            </w:r>
+          </w:p>
+        </w:tc>
+        <w:tc>
+          <w:tcPr>
+            <w:tcW w:type="dxa" w:w="5688"/>
+            <w:vAlign w:val="center"/>
+          </w:tcPr>
+          <w:p>
+            <w:pPr>
+              <w:spacing w:after="60" w:before="60" w:line="240" w:lineRule="auto"/>
+              <w:jc w:val="center"/>
+            </w:pPr>
+            <w:r>
+              <w:rPr>
+                <w:rFonts w:ascii="Times New Roman" w:hAnsi="Times New Roman"/>
+                <w:b w:val="0"/>
+                <w:color w:val="000000"/>
+                <w:sz w:val="18"/>
+              </w:rPr>
+              <w:t>M010, M013</w:t>
+            </w:r>
+          </w:p>
+        </w:tc>
+      </w:tr>
+      <w:tr>
+        <w:trPr>
+          <w:cantSplit/>
+        </w:trPr>
+        <w:tc>
+          <w:tcPr>
+            <w:tcW w:type="dxa" w:w="3600"/>
+            <w:vAlign w:val="center"/>
+          </w:tcPr>
+          <w:p>
+            <w:pPr>
+              <w:keepNext/>
+              <w:spacing w:after="60" w:before="60" w:line="240" w:lineRule="auto"/>
+              <w:jc w:val="left"/>
+            </w:pPr>
+            <w:r>
+              <w:rPr>
+                <w:rFonts w:ascii="Times New Roman" w:hAnsi="Times New Roman"/>
+                <w:b w:val="0"/>
+                <w:color w:val="000000"/>
+                <w:sz w:val="18"/>
+              </w:rPr>
+              <w:t>Inadequate source-limit explanation</w:t>
+            </w:r>
+          </w:p>
+        </w:tc>
+        <w:tc>
+          <w:tcPr>
+            <w:tcW w:type="dxa" w:w="792"/>
+            <w:vAlign w:val="center"/>
+          </w:tcPr>
+          <w:p>
+            <w:pPr>
+              <w:keepNext/>
+              <w:spacing w:after="60" w:before="60" w:line="240" w:lineRule="auto"/>
+              <w:jc w:val="center"/>
+            </w:pPr>
+            <w:r>
+              <w:rPr>
+                <w:rFonts w:ascii="Times New Roman" w:hAnsi="Times New Roman"/>
+                <w:b w:val="0"/>
+                <w:color w:val="000000"/>
+                <w:sz w:val="18"/>
+              </w:rPr>
+              <w:t>1</w:t>
+            </w:r>
+          </w:p>
+        </w:tc>
+        <w:tc>
+          <w:tcPr>
+            <w:tcW w:type="dxa" w:w="5688"/>
+            <w:vAlign w:val="center"/>
+          </w:tcPr>
+          <w:p>
+            <w:pPr>
+              <w:keepNext/>
+              <w:spacing w:after="60" w:before="60" w:line="240" w:lineRule="auto"/>
+              <w:jc w:val="center"/>
+            </w:pPr>
+            <w:r>
+              <w:rPr>
+                <w:rFonts w:ascii="Times New Roman" w:hAnsi="Times New Roman"/>
+                <w:b w:val="0"/>
+                <w:color w:val="000000"/>
+                <w:sz w:val="18"/>
+              </w:rPr>
+              <w:t>M031</w:t>
+            </w:r>
+          </w:p>
+        </w:tc>
+      </w:tr>
+    </w:tbl>
+    <w:p>
+      <w:pPr>
+        <w:keepNext w:val="0"/>
+        <w:widowControl/>
+        <w:spacing w:after="140" w:line="250" w:lineRule="auto"/>
+      </w:pPr>
+      <w:r>
+        <w:rPr>
+          <w:rFonts w:ascii="Times New Roman" w:hAnsi="Times New Roman"/>
+          <w:i/>
+          <w:color w:val="000000"/>
+          <w:sz w:val="17"/>
+        </w:rPr>
+        <w:t>Table 4. The 19 unsuccessful cases, grouped once each by their principal recorded issue. Case-level reasons and all 40 responses remain available in the linked artifacts.</w:t>
+      </w:r>
+    </w:p>
+    <w:p>
+      <w:pPr>
+        <w:keepNext w:val="0"/>
+        <w:widowControl/>
+        <w:spacing w:after="100" w:line="250" w:lineRule="auto"/>
+      </w:pPr>
+      <w:r>
+        <w:rPr>
+          <w:rFonts w:ascii="Times New Roman" w:hAnsi="Times New Roman"/>
+          <w:color w:val="000000"/>
+          <w:sz w:val="20"/>
+        </w:rPr>
+        <w:t>M036 triggered number_without_source_witness, so its missing answer includes a numeric-guard refusal. M026 and M034 have uncertain semantic labels, which remain failures under the scoring rule. No unsuccessful case was removed, relabeled, or retried for this revision.</w:t>
+      </w:r>
+    </w:p>
+    <w:p>
+      <w:pPr>
+        <w:keepNext/>
+        <w:pageBreakBefore w:val="0"/>
+        <w:widowControl/>
+        <w:spacing w:after="100" w:line="250" w:lineRule="auto" w:before="140"/>
+      </w:pPr>
+      <w:r>
+        <w:rPr>
+          <w:rFonts w:ascii="Times New Roman" w:hAnsi="Times New Roman"/>
+          <w:b/>
+          <w:color w:val="000000"/>
           <w:sz w:val="21"/>
         </w:rPr>
         <w:t>8. Future Work</w:t>
@@ -2462,26 +3619,111 @@
     </w:p>
     <w:p>
       <w:pPr>
-        <w:jc w:val="both"/>
+        <w:keepNext w:val="0"/>
+        <w:widowControl/>
+        <w:spacing w:after="100" w:line="250" w:lineRule="auto"/>
       </w:pPr>
       <w:r>
         <w:rPr>
-          <w:highlight w:val="yellow"/>
+          <w:rFonts w:ascii="Times New Roman" w:hAnsi="Times New Roman"/>
+          <w:color w:val="000000"/>
+          <w:sz w:val="20"/>
         </w:rPr>
-        <w:t>(1) Human-verify all 40 gold items, freeze the 24/16 split, and run B0 to B3 once on the sealed 16 items with paired bootstrap intervals, replacing today's AI-assessed figures.</w:t>
+        <w:t>Human-review the original course reference labels, freeze the planned 24/16 development/test split, and run the B0-B3 final comparison once under its evaluation gates. Separately, review the product-aligned matrix and calibrate its AI assessor against human grades. Use development cases to improve completeness and reduce over-refusal, then evaluate the hosted API/browser path and multi-turn conversations. Verify table/PDF extraction and replace the placeholder crawler contact. None of these pending measurements is established by offline replay.</w:t>
       </w:r>
+    </w:p>
+    <w:p>
+      <w:pPr>
+        <w:keepNext w:val="0"/>
+        <w:widowControl/>
+        <w:spacing w:after="100" w:line="250" w:lineRule="auto"/>
+      </w:pPr>
       <w:r>
-        <w:t xml:space="preserve"> </w:t>
+        <w:rPr>
+          <w:rFonts w:ascii="Times New Roman" w:hAnsi="Times New Roman"/>
+          <w:b/>
+          <w:color w:val="000000"/>
+          <w:sz w:val="20"/>
+        </w:rPr>
+        <w:t xml:space="preserve">Reproducibility. </w:t>
       </w:r>
       <w:r>
         <w:rPr>
-          <w:highlight w:val="yellow"/>
+          <w:rFonts w:ascii="Times New Roman" w:hAnsi="Times New Roman"/>
+          <w:color w:val="000000"/>
+          <w:sz w:val="20"/>
         </w:rPr>
-        <w:t>(2) Calibrate the AI claim reviewer against human labels and reduce over-refusals (3 of 30 answerable cases).</w:t>
+        <w:t>The repository preserves the original paper, saved responses, exact metric counts, and reproducible PNG/SVG charts. Run scripts/evaluate.py --check to reproduce scores without provider calls; the figures and manuscript have separate offline check commands documented in the evaluation workflow.</w:t>
       </w:r>
+    </w:p>
+    <w:p>
+      <w:pPr>
+        <w:keepNext w:val="0"/>
+        <w:widowControl/>
+        <w:spacing w:after="80" w:line="250" w:lineRule="auto"/>
+      </w:pPr>
       <w:r>
-        <w:t xml:space="preserve"> (3) Measure the hosted profile itself, which has no reranker, and restore cross-park comparisons that the one-park interface currently excludes. (4) Verify the 45 table-bearing documents and the PDF extraction, replace the placeholder crawler contact, and calibrate an answerability threshold on development data.</w:t>
+        <w:rPr>
+          <w:rFonts w:ascii="Times New Roman" w:hAnsi="Times New Roman"/>
+          <w:color w:val="000000"/>
+          <w:sz w:val="18"/>
+        </w:rPr>
       </w:r>
+      <w:hyperlink r:id="rId11">
+        <w:r>
+          <w:rPr>
+            <w:color w:val="245957"/>
+            <w:sz w:val="18"/>
+          </w:rPr>
+          <w:t>Evaluation report and methods</w:t>
+        </w:r>
+      </w:hyperlink>
+    </w:p>
+    <w:p>
+      <w:pPr>
+        <w:keepNext w:val="0"/>
+        <w:widowControl/>
+        <w:spacing w:after="80" w:line="250" w:lineRule="auto"/>
+      </w:pPr>
+      <w:r>
+        <w:rPr>
+          <w:rFonts w:ascii="Times New Roman" w:hAnsi="Times New Roman"/>
+          <w:color w:val="000000"/>
+          <w:sz w:val="18"/>
+        </w:rPr>
+      </w:r>
+      <w:hyperlink r:id="rId12">
+        <w:r>
+          <w:rPr>
+            <w:color w:val="245957"/>
+            <w:sz w:val="18"/>
+          </w:rPr>
+          <w:t>All 40 question results and recorded failures</w:t>
+        </w:r>
+      </w:hyperlink>
+    </w:p>
+    <w:p>
+      <w:pPr>
+        <w:keepNext w:val="0"/>
+        <w:widowControl/>
+        <w:spacing w:after="80" w:line="250" w:lineRule="auto"/>
+      </w:pPr>
+      <w:r>
+        <w:rPr>
+          <w:rFonts w:ascii="Times New Roman" w:hAnsi="Times New Roman"/>
+          <w:color w:val="000000"/>
+          <w:sz w:val="18"/>
+        </w:rPr>
+      </w:r>
+      <w:hyperlink r:id="rId13">
+        <w:r>
+          <w:rPr>
+            <w:color w:val="245957"/>
+            <w:sz w:val="18"/>
+          </w:rPr>
+          <w:t>Figure data, source hashes, and reproduction workflow</w:t>
+        </w:r>
+      </w:hyperlink>
     </w:p>
     <w:sectPr>
       <w:pgSz w:w="12240" w:h="15840"/>
@@ -3433,15 +4675,12 @@
     <w:qFormat/>
     <w:rsid w:val="00FC693F"/>
     <w:pPr>
-      <w:pBdr>
-        <w:bottom w:val="single" w:sz="8" w:space="4" w:color="4F81BD" w:themeColor="accent1"/>
-      </w:pBdr>
       <w:spacing w:after="300"/>
       <w:contextualSpacing/>
     </w:pPr>
     <w:rPr>
       <w:rFonts w:asciiTheme="majorHAnsi" w:eastAsiaTheme="majorEastAsia" w:hAnsiTheme="majorHAnsi" w:cstheme="majorBidi"/>
-      <w:color w:val="17365D" w:themeColor="text2" w:themeShade="BF"/>
+      <w:color w:val="000000"/>
       <w:spacing w:val="5"/>
       <w:kern w:val="28"/>
       <w:sz w:val="52"/>

</xml_diff>

<commit_message>
Add Robin's engineer contribution to research paper
</commit_message>
<xml_diff>
--- a/reports/research-paper/ParkGuide_AI_Research_Paper.docx
+++ b/reports/research-paper/ParkGuide_AI_Research_Paper.docx
@@ -643,9 +643,26 @@
               <w:spacing w:after="0"/>
               <w:rPr>
                 <w:sz w:val="16"/>
-                <w:highlight w:val="yellow"/>
               </w:rPr>
             </w:pPr>
+            <w:r>
+              <w:rPr>
+                <w:rFonts w:ascii="Times New Roman" w:hAnsi="Times New Roman"/>
+                <w:b/>
+                <w:color w:val="000000"/>
+                <w:sz w:val="16"/>
+              </w:rPr>
+              <w:t xml:space="preserve">Engineer: </w:t>
+            </w:r>
+            <w:r>
+              <w:rPr>
+                <w:rFonts w:ascii="Times New Roman" w:hAnsi="Times New Roman"/>
+                <w:b w:val="0"/>
+                <w:color w:val="000000"/>
+                <w:sz w:val="16"/>
+              </w:rPr>
+              <w:t>Built the RAG pipeline, integrated Azure models and SQLite, and developed the React/FastAPI web app. Added park selection, source previews, and retrieval inspectors. Improved citation safeguards and conversation reliability, deployed the application on Vercel, and supported testing and technical documentation.</w:t>
+            </w:r>
           </w:p>
         </w:tc>
       </w:tr>

</xml_diff>